<commit_message>
Update thesis draft and AIGC review artifacts
</commit_message>
<xml_diff>
--- a/论文/信电学院2026届毕业论文（设计） 郑毅航.docx
+++ b/论文/信电学院2026届毕业论文（设计） 郑毅航.docx
@@ -463,7 +463,27 @@
                 <w:sz w:val="32"/>
                 <w:u w:val="none"/>
               </w:rPr>
-              <w:t>基于树形网络结构的个人物联网平台</w:t>
+              <w:t>基于树形网络结构的</w:t>
+            </w:r>
+            <w:proofErr w:type="gramStart"/>
+            <w:r>
+              <w:rPr>
+                <w:rStyle w:val="af9"/>
+                <w:rFonts w:ascii="Times New Roman" w:eastAsia="黑体" w:hAnsi="Times New Roman" w:hint="eastAsia"/>
+                <w:sz w:val="32"/>
+                <w:u w:val="none"/>
+              </w:rPr>
+              <w:t>个</w:t>
+            </w:r>
+            <w:proofErr w:type="gramEnd"/>
+            <w:r>
+              <w:rPr>
+                <w:rStyle w:val="af9"/>
+                <w:rFonts w:ascii="Times New Roman" w:eastAsia="黑体" w:hAnsi="Times New Roman" w:hint="eastAsia"/>
+                <w:sz w:val="32"/>
+                <w:u w:val="none"/>
+              </w:rPr>
+              <w:t>人物联网平台</w:t>
             </w:r>
           </w:p>
         </w:tc>
@@ -521,6 +541,7 @@
                 <w:szCs w:val="32"/>
               </w:rPr>
             </w:pPr>
+            <w:proofErr w:type="gramStart"/>
             <w:r>
               <w:rPr>
                 <w:rStyle w:val="aff1"/>
@@ -530,6 +551,7 @@
               </w:rPr>
               <w:t>郑毅航</w:t>
             </w:r>
+            <w:proofErr w:type="gramEnd"/>
           </w:p>
         </w:tc>
       </w:tr>
@@ -947,7 +969,21 @@
           <w:rFonts w:hint="eastAsia"/>
         </w:rPr>
         <w:lastRenderedPageBreak/>
-        <w:t>基于树形网络结构的个人物联网平台</w:t>
+        <w:t>基于树形网络结构的</w:t>
+      </w:r>
+      <w:proofErr w:type="gramStart"/>
+      <w:r>
+        <w:rPr>
+          <w:rFonts w:hint="eastAsia"/>
+        </w:rPr>
+        <w:t>个</w:t>
+      </w:r>
+      <w:proofErr w:type="gramEnd"/>
+      <w:r>
+        <w:rPr>
+          <w:rFonts w:hint="eastAsia"/>
+        </w:rPr>
+        <w:t>人物联网平台</w:t>
       </w:r>
     </w:p>
     <w:p>
@@ -991,13 +1027,45 @@
           <w:rStyle w:val="Char"/>
           <w:rFonts w:hint="eastAsia"/>
         </w:rPr>
-        <w:t>为统一抽象，在统一消息封装之上构建了树形路由、收发处理链路、逐跳转发与子协议承载机制，并形成</w:t>
-      </w:r>
+        <w:t>为统一抽象，在统一消息封装之上构建了树形路由、收发处理链路、</w:t>
+      </w:r>
+      <w:proofErr w:type="gramStart"/>
       <w:r>
         <w:rPr>
           <w:rStyle w:val="Char"/>
           <w:rFonts w:hint="eastAsia"/>
         </w:rPr>
+        <w:t>逐跳转发</w:t>
+      </w:r>
+      <w:proofErr w:type="gramEnd"/>
+      <w:r>
+        <w:rPr>
+          <w:rStyle w:val="Char"/>
+          <w:rFonts w:hint="eastAsia"/>
+        </w:rPr>
+        <w:t>与</w:t>
+      </w:r>
+      <w:proofErr w:type="gramStart"/>
+      <w:r>
+        <w:rPr>
+          <w:rStyle w:val="Char"/>
+          <w:rFonts w:hint="eastAsia"/>
+        </w:rPr>
+        <w:t>子协议</w:t>
+      </w:r>
+      <w:proofErr w:type="gramEnd"/>
+      <w:r>
+        <w:rPr>
+          <w:rStyle w:val="Char"/>
+          <w:rFonts w:hint="eastAsia"/>
+        </w:rPr>
+        <w:t>承载机制，并形成</w:t>
+      </w:r>
+      <w:r>
+        <w:rPr>
+          <w:rStyle w:val="Char"/>
+          <w:rFonts w:hint="eastAsia"/>
+        </w:rPr>
         <w:t xml:space="preserve"> Proto</w:t>
       </w:r>
       <w:r>
@@ -1035,6 +1103,7 @@
         </w:rPr>
         <w:t>、</w:t>
       </w:r>
+      <w:proofErr w:type="spellStart"/>
       <w:r>
         <w:rPr>
           <w:rStyle w:val="Char"/>
@@ -1042,6 +1111,7 @@
         </w:rPr>
         <w:t>SubProto</w:t>
       </w:r>
+      <w:proofErr w:type="spellEnd"/>
       <w:r>
         <w:rPr>
           <w:rStyle w:val="Char"/>
@@ -1091,6 +1161,7 @@
         </w:rPr>
         <w:t>、</w:t>
       </w:r>
+      <w:proofErr w:type="spellStart"/>
       <w:r>
         <w:rPr>
           <w:rStyle w:val="Char"/>
@@ -1098,6 +1169,7 @@
         </w:rPr>
         <w:t>VarStore</w:t>
       </w:r>
+      <w:proofErr w:type="spellEnd"/>
       <w:r>
         <w:rPr>
           <w:rStyle w:val="Char"/>
@@ -1105,6 +1177,7 @@
         </w:rPr>
         <w:t>、</w:t>
       </w:r>
+      <w:proofErr w:type="spellStart"/>
       <w:r>
         <w:rPr>
           <w:rStyle w:val="Char"/>
@@ -1112,6 +1185,7 @@
         </w:rPr>
         <w:t>TopicBus</w:t>
       </w:r>
+      <w:proofErr w:type="spellEnd"/>
       <w:r>
         <w:rPr>
           <w:rStyle w:val="Char"/>
@@ -1194,13 +1268,29 @@
           <w:rStyle w:val="Char"/>
           <w:rFonts w:hint="eastAsia"/>
         </w:rPr>
-        <w:t xml:space="preserve"> hub_server sidecar </w:t>
-      </w:r>
+        <w:t xml:space="preserve"> </w:t>
+      </w:r>
+      <w:proofErr w:type="spellStart"/>
       <w:r>
         <w:rPr>
           <w:rStyle w:val="Char"/>
           <w:rFonts w:hint="eastAsia"/>
         </w:rPr>
+        <w:t>hub_server</w:t>
+      </w:r>
+      <w:proofErr w:type="spellEnd"/>
+      <w:r>
+        <w:rPr>
+          <w:rStyle w:val="Char"/>
+          <w:rFonts w:hint="eastAsia"/>
+        </w:rPr>
+        <w:t xml:space="preserve"> sidecar </w:t>
+      </w:r>
+      <w:r>
+        <w:rPr>
+          <w:rStyle w:val="Char"/>
+          <w:rFonts w:hint="eastAsia"/>
+        </w:rPr>
         <w:t>进程，提供本地</w:t>
       </w:r>
       <w:r>
@@ -1215,7 +1305,39 @@
           <w:rStyle w:val="Char"/>
           <w:rFonts w:hint="eastAsia"/>
         </w:rPr>
-        <w:t>启动、节点接入和协议调试入口。结果表明，该系统能够在不依赖固定云中心的条件下支持本地部署、多节点协同和协议扩展，较好满足个人物联网场景对可扩展组网与本地运维的需求。</w:t>
+        <w:t>启动、节点接入和协议调试入口。结果表明，该系统能够在不依赖</w:t>
+      </w:r>
+      <w:proofErr w:type="gramStart"/>
+      <w:r>
+        <w:rPr>
+          <w:rStyle w:val="Char"/>
+          <w:rFonts w:hint="eastAsia"/>
+        </w:rPr>
+        <w:t>固定云中心</w:t>
+      </w:r>
+      <w:proofErr w:type="gramEnd"/>
+      <w:r>
+        <w:rPr>
+          <w:rStyle w:val="Char"/>
+          <w:rFonts w:hint="eastAsia"/>
+        </w:rPr>
+        <w:t>的条件下支持本地部署、多节点协同和协议扩展，较好满足个人物联网场景对可</w:t>
+      </w:r>
+      <w:proofErr w:type="gramStart"/>
+      <w:r>
+        <w:rPr>
+          <w:rStyle w:val="Char"/>
+          <w:rFonts w:hint="eastAsia"/>
+        </w:rPr>
+        <w:t>扩展组</w:t>
+      </w:r>
+      <w:proofErr w:type="gramEnd"/>
+      <w:r>
+        <w:rPr>
+          <w:rStyle w:val="Char"/>
+          <w:rFonts w:hint="eastAsia"/>
+        </w:rPr>
+        <w:t>网与本地运维的需求。</w:t>
       </w:r>
     </w:p>
     <w:p>
@@ -1272,11 +1394,19 @@
         </w:rPr>
         <w:t>；</w:t>
       </w:r>
-      <w:r>
-        <w:rPr>
-          <w:rFonts w:hint="eastAsia"/>
-        </w:rPr>
-        <w:t>个人物联网</w:t>
+      <w:proofErr w:type="gramStart"/>
+      <w:r>
+        <w:rPr>
+          <w:rFonts w:hint="eastAsia"/>
+        </w:rPr>
+        <w:t>个</w:t>
+      </w:r>
+      <w:proofErr w:type="gramEnd"/>
+      <w:r>
+        <w:rPr>
+          <w:rFonts w:hint="eastAsia"/>
+        </w:rPr>
+        <w:t>人物联网</w:t>
       </w:r>
       <w:r>
         <w:rPr>
@@ -1382,7 +1512,39 @@
         <w:t xml:space="preserve">: </w:t>
       </w:r>
       <w:r>
-        <w:t>For personal IoT scenarios such as homes and personal laboratories, this thesis designs and implements a tree-topology message hub system to address the limitations of traditional star-topology platforms in multi-hop coverage, local deployment, and scalable collaboration. Using Node as the unified abstraction, the system organizes devices through parent-child hierarchies and builds tree-based routing, receive-send pipelines, hop-by-hop forwarding, and subprotocol hosting on top of a unified message envelope. It forms a layered architecture of Proto, Core, SDK, SubProto, Server, and Win to organize capabilities such as Auth, VarStore, TopicBus, File, Flow, and Exec. In the engineering implementation, the Windows client manages the local hub_server sidecar through the Local Hub mechanism and provides an entry for local hub startup, node access, and protocol debugging. The results show that the system can support local deployment, multi-node collaboration, and protocol extension without relying on a fixed cloud center, making it suitable for personal IoT scenarios that require scalable networking and local operations.</w:t>
+        <w:t xml:space="preserve">For personal IoT scenarios such as homes and personal laboratories, this thesis designs and implements a tree-topology message hub system to address the limitations of traditional star-topology platforms in multi-hop coverage, local deployment, and scalable collaboration. Using Node as the unified abstraction, the system organizes devices through parent-child hierarchies and builds tree-based routing, receive-send pipelines, hop-by-hop forwarding, and subprotocol hosting on top of a unified message envelope. It forms a layered architecture of Proto, Core, SDK, </w:t>
+      </w:r>
+      <w:proofErr w:type="spellStart"/>
+      <w:r>
+        <w:t>SubProto</w:t>
+      </w:r>
+      <w:proofErr w:type="spellEnd"/>
+      <w:r>
+        <w:t xml:space="preserve">, Server, and Win to organize capabilities such as Auth, </w:t>
+      </w:r>
+      <w:proofErr w:type="spellStart"/>
+      <w:r>
+        <w:t>VarStore</w:t>
+      </w:r>
+      <w:proofErr w:type="spellEnd"/>
+      <w:r>
+        <w:t xml:space="preserve">, </w:t>
+      </w:r>
+      <w:proofErr w:type="spellStart"/>
+      <w:r>
+        <w:t>TopicBus</w:t>
+      </w:r>
+      <w:proofErr w:type="spellEnd"/>
+      <w:r>
+        <w:t xml:space="preserve">, File, Flow, and Exec. In the engineering implementation, the Windows client manages the local </w:t>
+      </w:r>
+      <w:proofErr w:type="spellStart"/>
+      <w:r>
+        <w:t>hub_server</w:t>
+      </w:r>
+      <w:proofErr w:type="spellEnd"/>
+      <w:r>
+        <w:t xml:space="preserve"> sidecar through the Local Hub mechanism and provides an entry for local hub startup, node access, and protocol debugging. The results show that the system can support local deployment, multi-node collaboration, and protocol extension without relying on a fixed cloud center, making it suitable for personal IoT scenarios that require scalable networking and local operations.</w:t>
       </w:r>
     </w:p>
     <w:p>
@@ -1458,10 +1620,18 @@
         <w:t>M</w:t>
       </w:r>
       <w:r>
-        <w:t>essage hub</w:t>
-      </w:r>
-      <w:r>
-        <w:t xml:space="preserve">; </w:t>
+        <w:t xml:space="preserve">essage </w:t>
+      </w:r>
+      <w:proofErr w:type="gramStart"/>
+      <w:r>
+        <w:t>hub</w:t>
+      </w:r>
+      <w:r>
+        <w:t>;</w:t>
+      </w:r>
+      <w:proofErr w:type="gramEnd"/>
+      <w:r>
+        <w:t xml:space="preserve"> </w:t>
       </w:r>
     </w:p>
     <w:p>
@@ -6583,7 +6753,21 @@
         <w:rPr>
           <w:rFonts w:hint="eastAsia"/>
         </w:rPr>
-        <w:t>物联网技术正由工业控制和公共基础设施场景逐步延伸到家庭、个人工作室、实验空间以及轻量边缘环境。在这类个人物联网场景中，用户更关注低门槛部署、本地自治、低成本扩展以及跨设备协作能力。然而，现有大量平台仍以中心网关或云端控制面为核心，终端设备通常需要依附于特定品牌生态或固定平台，难以适应个人场景中设备来源复杂、部署环境分散、节点能力差异显著的实际需求</w:t>
+        <w:t>物联网技术正由工业控制和公共基础设施场景逐步延伸到家庭、个人工作室、实验空间以及轻量边缘环境。在这类</w:t>
+      </w:r>
+      <w:proofErr w:type="gramStart"/>
+      <w:r>
+        <w:rPr>
+          <w:rFonts w:hint="eastAsia"/>
+        </w:rPr>
+        <w:t>个</w:t>
+      </w:r>
+      <w:proofErr w:type="gramEnd"/>
+      <w:r>
+        <w:rPr>
+          <w:rFonts w:hint="eastAsia"/>
+        </w:rPr>
+        <w:t>人物联网场景中，用户更关注低门槛部署、本地自治、低成本扩展以及跨设备协作能力。然而，现有大量平台仍以中心网关或云端控制面为核心，终端设备通常需要依附于特定品牌生态或固定平台，难以适应个人场景中设备来源复杂、部署环境分散、节点能力差异显著的实际需求</w:t>
       </w:r>
       <w:r>
         <w:rPr>
@@ -6609,7 +6793,49 @@
         <w:rPr>
           <w:rFonts w:hint="eastAsia"/>
         </w:rPr>
-        <w:t>就网络组织方式而言，传统星型拓扑适合单层、短距离和中心明确的应用环境，但当应用场景扩展到多房间、多楼层、弱网区域或跨子区域协同时，中心化结构容易暴露出覆盖不足、转发路径单一和中间节点利用率偏低等问题。已有研究表明，树形拓扑在层级路由、链路维护和网络延展方面具有较好的适配性，能够在分层环境中更自然地处理多跳转发和子树组织问题</w:t>
+        <w:t>就网络组织方式而言，传统星型拓扑适合单层、短距离和中心明确的应用环境，但</w:t>
+      </w:r>
+      <w:proofErr w:type="gramStart"/>
+      <w:r>
+        <w:rPr>
+          <w:rFonts w:hint="eastAsia"/>
+        </w:rPr>
+        <w:t>当应用</w:t>
+      </w:r>
+      <w:proofErr w:type="gramEnd"/>
+      <w:r>
+        <w:rPr>
+          <w:rFonts w:hint="eastAsia"/>
+        </w:rPr>
+        <w:t>场景扩展到多房间、多楼层、</w:t>
+      </w:r>
+      <w:proofErr w:type="gramStart"/>
+      <w:r>
+        <w:rPr>
+          <w:rFonts w:hint="eastAsia"/>
+        </w:rPr>
+        <w:t>弱网区域或跨子</w:t>
+      </w:r>
+      <w:proofErr w:type="gramEnd"/>
+      <w:r>
+        <w:rPr>
+          <w:rFonts w:hint="eastAsia"/>
+        </w:rPr>
+        <w:t>区域协同时，中心化结构容易暴露出覆盖不足、转发路径单一和中间节点利用率偏低等问题。已有研究表明，树形拓扑在层级路由、链路维护和网络延展方面具有较好的适配性，能够在分层环境中更自然地处理多跳转发和子</w:t>
+      </w:r>
+      <w:proofErr w:type="gramStart"/>
+      <w:r>
+        <w:rPr>
+          <w:rFonts w:hint="eastAsia"/>
+        </w:rPr>
+        <w:t>树组织</w:t>
+      </w:r>
+      <w:proofErr w:type="gramEnd"/>
+      <w:r>
+        <w:rPr>
+          <w:rFonts w:hint="eastAsia"/>
+        </w:rPr>
+        <w:t>问题</w:t>
       </w:r>
       <w:r>
         <w:rPr>
@@ -6635,7 +6861,35 @@
         <w:rPr>
           <w:rFonts w:hint="eastAsia"/>
         </w:rPr>
-        <w:t>从节点角色划分来看，传统方案通常预设网关、中继和终端等静态角色，导致设备用途相对固化。相比之下，个人物联网更适合采用统一、可配置的软件抽象，将不同设备视为能力不同但逻辑一致的节点。这样，算力或网络能力较强的节点可以在需要时承担路由、转发和局部管理职责，而资源受限的节点则保留为数据采集或执行终端。该思路既符合边缘计算向多层协同演进的趋势，也有利于提升设备复用率和组网弹性</w:t>
+        <w:t>从节点角色划分来看，传统方案通常预设网关、中继和终端等静态角色，导致设备用途相对固化。相比之下，</w:t>
+      </w:r>
+      <w:proofErr w:type="gramStart"/>
+      <w:r>
+        <w:rPr>
+          <w:rFonts w:hint="eastAsia"/>
+        </w:rPr>
+        <w:t>个</w:t>
+      </w:r>
+      <w:proofErr w:type="gramEnd"/>
+      <w:r>
+        <w:rPr>
+          <w:rFonts w:hint="eastAsia"/>
+        </w:rPr>
+        <w:t>人物联网更适合采用统一、可配置的软件抽象，将不同设备视为能力不同但逻辑一致的节点。这样，</w:t>
+      </w:r>
+      <w:proofErr w:type="gramStart"/>
+      <w:r>
+        <w:rPr>
+          <w:rFonts w:hint="eastAsia"/>
+        </w:rPr>
+        <w:t>算力或</w:t>
+      </w:r>
+      <w:proofErr w:type="gramEnd"/>
+      <w:r>
+        <w:rPr>
+          <w:rFonts w:hint="eastAsia"/>
+        </w:rPr>
+        <w:t>网络能力较强的节点可以在需要时承担路由、转发和局部管理职责，而资源受限的节点则保留为数据采集或执行终端。该思路既符合边缘计算向多层协同演进的趋势，也有利于提升设备复用率和组网弹性</w:t>
       </w:r>
       <w:r>
         <w:rPr>
@@ -6661,7 +6915,21 @@
         <w:rPr>
           <w:rFonts w:hint="eastAsia"/>
         </w:rPr>
-        <w:t>在安全与控制层面，个人物联网虽然规模较小，但权限边界并不简单。一个局部节点既可能是传感器数据提供者，也可能承担文件接收、能力执行或工作流运行等职责。若系统缺乏统一的身份确认与权限表达机制，跨节点调用、局部自治和多用户协作过程中就容易出现控制混乱与安全隐患。近年来关于</w:t>
+        <w:t>在安全与控制层面，</w:t>
+      </w:r>
+      <w:proofErr w:type="gramStart"/>
+      <w:r>
+        <w:rPr>
+          <w:rFonts w:hint="eastAsia"/>
+        </w:rPr>
+        <w:t>个</w:t>
+      </w:r>
+      <w:proofErr w:type="gramEnd"/>
+      <w:r>
+        <w:rPr>
+          <w:rFonts w:hint="eastAsia"/>
+        </w:rPr>
+        <w:t>人物联网虽然规模较小，但权限边界并不简单。一个局部节点既可能是传感器数据提供者，也可能承担文件接收、能力执行或工作流运行等职责。若系统缺乏统一的身份确认与权限表达机制，跨节点调用、局部自治和多用户协作过程中就容易出现控制混乱与安全隐患。近年来关于</w:t>
       </w:r>
       <w:r>
         <w:rPr>
@@ -6727,7 +6995,21 @@
         <w:rPr>
           <w:rFonts w:hint="eastAsia"/>
         </w:rPr>
-        <w:t>基于上述背景，本文围绕“基于树形拓扑的个人物联网消息中枢系统设计与实现”展开研究，尝试构建一套更适合个人物联网场景的系统方案。该方案以消息中枢为核心，通过统一的</w:t>
+        <w:t>基于上述背景，本文围绕“基于树形拓扑的</w:t>
+      </w:r>
+      <w:proofErr w:type="gramStart"/>
+      <w:r>
+        <w:rPr>
+          <w:rFonts w:hint="eastAsia"/>
+        </w:rPr>
+        <w:t>个</w:t>
+      </w:r>
+      <w:proofErr w:type="gramEnd"/>
+      <w:r>
+        <w:rPr>
+          <w:rFonts w:hint="eastAsia"/>
+        </w:rPr>
+        <w:t>人物联网消息中枢系统设计与实现”展开研究，尝试构建一套更适合个人物联网场景的系统方案。该方案以消息中枢为核心，通过统一的</w:t>
       </w:r>
       <w:r>
         <w:rPr>
@@ -6739,7 +7021,21 @@
         <w:rPr>
           <w:rFonts w:hint="eastAsia"/>
         </w:rPr>
-        <w:t>抽象、树形转发机制、身份认证与权限控制模型以及可扩展的子协议体系，在本地环境中组织多节点协作。其研究意义主要体现在三个方面：为个人物联网提供更灵活的本地部署路径；为多跳、分层场景下的消息路由与控制提供统一框架；为文件传输、流程编排和能力调用等功能的持续扩展提供稳定基础。</w:t>
+        <w:t>抽象、树形转发机制、身份认证与权限控制模型以及可扩展的</w:t>
+      </w:r>
+      <w:proofErr w:type="gramStart"/>
+      <w:r>
+        <w:rPr>
+          <w:rFonts w:hint="eastAsia"/>
+        </w:rPr>
+        <w:t>子协议</w:t>
+      </w:r>
+      <w:proofErr w:type="gramEnd"/>
+      <w:r>
+        <w:rPr>
+          <w:rFonts w:hint="eastAsia"/>
+        </w:rPr>
+        <w:t>体系，在本地环境中组织多节点协作。其研究意义主要体现在三个方面：为个人物联网提供更灵活的本地部署路径；为多跳、分层场景下的消息路由与控制提供统一框架；为文件传输、流程编排和能力调用等功能的持续扩展提供稳定基础。</w:t>
       </w:r>
     </w:p>
     <w:p>
@@ -6836,7 +7132,21 @@
         <w:rPr>
           <w:rFonts w:hint="eastAsia"/>
         </w:rPr>
-        <w:t>其次，在异构协议融合与互联互通方面，智能家居和边缘网关相关研究普遍强调多协议接入与统一抽象的重要性。周犇围绕</w:t>
+        <w:t>其次，在异构协议融合与互联互通方面，智能家居和边缘网关相关研究普遍强调多协议接入与统一抽象的重要性。周</w:t>
+      </w:r>
+      <w:proofErr w:type="gramStart"/>
+      <w:r>
+        <w:rPr>
+          <w:rFonts w:hint="eastAsia"/>
+        </w:rPr>
+        <w:t>犇</w:t>
+      </w:r>
+      <w:proofErr w:type="gramEnd"/>
+      <w:r>
+        <w:rPr>
+          <w:rFonts w:hint="eastAsia"/>
+        </w:rPr>
+        <w:t>围绕</w:t>
       </w:r>
       <w:r>
         <w:rPr>
@@ -6936,11 +7246,19 @@
         </w:rPr>
         <w:t>í</w:t>
       </w:r>
-      <w:r>
-        <w:rPr>
-          <w:rFonts w:hint="eastAsia"/>
-        </w:rPr>
-        <w:t xml:space="preserve">az </w:t>
+      <w:proofErr w:type="spellStart"/>
+      <w:r>
+        <w:rPr>
+          <w:rFonts w:hint="eastAsia"/>
+        </w:rPr>
+        <w:t>az</w:t>
+      </w:r>
+      <w:proofErr w:type="spellEnd"/>
+      <w:r>
+        <w:rPr>
+          <w:rFonts w:hint="eastAsia"/>
+        </w:rPr>
+        <w:t xml:space="preserve"> </w:t>
       </w:r>
       <w:r>
         <w:rPr>
@@ -7013,7 +7331,21 @@
         <w:rPr>
           <w:rFonts w:hint="eastAsia"/>
         </w:rPr>
-        <w:t>；王小芬、葛晶晶、王梅等则围绕物联网设备认证、持续认证和低交互认证协议，探讨了在资源受限条件下实现身份可信的具体方法</w:t>
+        <w:t>；王小芬、</w:t>
+      </w:r>
+      <w:proofErr w:type="gramStart"/>
+      <w:r>
+        <w:rPr>
+          <w:rFonts w:hint="eastAsia"/>
+        </w:rPr>
+        <w:t>葛</w:t>
+      </w:r>
+      <w:proofErr w:type="gramEnd"/>
+      <w:r>
+        <w:rPr>
+          <w:rFonts w:hint="eastAsia"/>
+        </w:rPr>
+        <w:t>晶晶、王梅等则围绕物联网设备认证、持续认证和低交互认证协议，探讨了在资源受限条件下实现身份可信的具体方法</w:t>
       </w:r>
       <w:r>
         <w:rPr>
@@ -7051,7 +7383,21 @@
         <w:rPr>
           <w:rFonts w:hint="eastAsia"/>
         </w:rPr>
-        <w:t>总体来看，现有研究已经在网络结构、协议融合和安全机制方面积累了较多成果，但仍存在两个明显不足。其一，大量研究面向云平台、工业边缘或标准网关展开，较少直接面向“个人物联网本地消息中枢”这一更轻量、更加重视本地自治的目标；其二，通信框架、认证权限和扩展协议往往被分别讨论，缺少一套围绕树形拓扑统一组织的工程化体系。基于此，本文结合当前项目的实际实现，尝试提出更适合个人物联网本地场景的系统设计方案。</w:t>
+        <w:t>总体来看，现有研究已经在网络结构、协议融合和安全机制方面积累了较多成果，但仍存在两个明显不足。其一，大量研究面向云平台、工业边缘或标准网关展开，较少直接面向“</w:t>
+      </w:r>
+      <w:proofErr w:type="gramStart"/>
+      <w:r>
+        <w:rPr>
+          <w:rFonts w:hint="eastAsia"/>
+        </w:rPr>
+        <w:t>个</w:t>
+      </w:r>
+      <w:proofErr w:type="gramEnd"/>
+      <w:r>
+        <w:rPr>
+          <w:rFonts w:hint="eastAsia"/>
+        </w:rPr>
+        <w:t>人物联网本地消息中枢”这一更轻量、更加重视本地自治的目标；其二，通信框架、认证权限和扩展协议往往被分别讨论，缺少一套围绕树形拓扑统一组织的工程化体系。基于此，本文结合当前项目的实际实现，尝试提出更适合个人物联网本地场景的系统设计方案。</w:t>
       </w:r>
     </w:p>
     <w:p>
@@ -7094,7 +7440,35 @@
         <w:rPr>
           <w:rFonts w:hint="eastAsia"/>
         </w:rPr>
-        <w:t>本文的总体目标是设计并实现一个面向个人物联网场景的树形拓扑消息中枢系统。该系统并非将所有设备简单接入单一中心，而是通过统一的节点抽象，使不同设备能够在运行期承担终端、转发和局部管理等职责，并在多跳环境中完成消息交换、身份认证、权限控制和扩展能力组织。</w:t>
+        <w:t>本文的总体目标是设计并实现一个面向个人物联网场景的树形拓扑消息中枢系统。该系统并非将所有设备简单接入单一中心，而是通过统一的节点抽象，使不同设备能够在运行</w:t>
+      </w:r>
+      <w:proofErr w:type="gramStart"/>
+      <w:r>
+        <w:rPr>
+          <w:rFonts w:hint="eastAsia"/>
+        </w:rPr>
+        <w:t>期承担</w:t>
+      </w:r>
+      <w:proofErr w:type="gramEnd"/>
+      <w:r>
+        <w:rPr>
+          <w:rFonts w:hint="eastAsia"/>
+        </w:rPr>
+        <w:t>终端、转发和局部管理等职责，并在多</w:t>
+      </w:r>
+      <w:proofErr w:type="gramStart"/>
+      <w:r>
+        <w:rPr>
+          <w:rFonts w:hint="eastAsia"/>
+        </w:rPr>
+        <w:t>跳环境</w:t>
+      </w:r>
+      <w:proofErr w:type="gramEnd"/>
+      <w:r>
+        <w:rPr>
+          <w:rFonts w:hint="eastAsia"/>
+        </w:rPr>
+        <w:t>中完成消息交换、身份认证、权限控制和扩展能力组织。</w:t>
       </w:r>
     </w:p>
     <w:p>
@@ -7111,32 +7485,44 @@
         <w:rPr>
           <w:rFonts w:hint="eastAsia"/>
         </w:rPr>
-        <w:t xml:space="preserve"> SourceID</w:t>
-      </w:r>
+        <w:t xml:space="preserve"> </w:t>
+      </w:r>
+      <w:proofErr w:type="spellStart"/>
+      <w:r>
+        <w:rPr>
+          <w:rFonts w:hint="eastAsia"/>
+        </w:rPr>
+        <w:t>SourceID</w:t>
+      </w:r>
+      <w:proofErr w:type="spellEnd"/>
       <w:r>
         <w:rPr>
           <w:rFonts w:hint="eastAsia"/>
         </w:rPr>
         <w:t>、</w:t>
       </w:r>
+      <w:proofErr w:type="spellStart"/>
       <w:r>
         <w:rPr>
           <w:rFonts w:hint="eastAsia"/>
         </w:rPr>
         <w:t>TargetID</w:t>
       </w:r>
+      <w:proofErr w:type="spellEnd"/>
       <w:r>
         <w:rPr>
           <w:rFonts w:hint="eastAsia"/>
         </w:rPr>
         <w:t>、</w:t>
       </w:r>
+      <w:proofErr w:type="spellStart"/>
       <w:r>
         <w:rPr>
           <w:rFonts w:hint="eastAsia"/>
         </w:rPr>
         <w:t>SubProto</w:t>
       </w:r>
+      <w:proofErr w:type="spellEnd"/>
       <w:r>
         <w:rPr>
           <w:rFonts w:hint="eastAsia"/>
@@ -7247,11 +7633,19 @@
         </w:rPr>
         <w:t>预路由、</w:t>
       </w:r>
-      <w:r>
-        <w:rPr>
-          <w:rFonts w:hint="eastAsia"/>
-        </w:rPr>
-        <w:t xml:space="preserve">SourceID </w:t>
+      <w:proofErr w:type="spellStart"/>
+      <w:r>
+        <w:rPr>
+          <w:rFonts w:hint="eastAsia"/>
+        </w:rPr>
+        <w:t>SourceID</w:t>
+      </w:r>
+      <w:proofErr w:type="spellEnd"/>
+      <w:r>
+        <w:rPr>
+          <w:rFonts w:hint="eastAsia"/>
+        </w:rPr>
+        <w:t xml:space="preserve"> </w:t>
       </w:r>
       <w:r>
         <w:rPr>
@@ -7290,24 +7684,28 @@
         </w:rPr>
         <w:t>、</w:t>
       </w:r>
+      <w:proofErr w:type="spellStart"/>
       <w:r>
         <w:rPr>
           <w:rFonts w:hint="eastAsia"/>
         </w:rPr>
         <w:t>VarStore</w:t>
       </w:r>
+      <w:proofErr w:type="spellEnd"/>
       <w:r>
         <w:rPr>
           <w:rFonts w:hint="eastAsia"/>
         </w:rPr>
         <w:t>、</w:t>
       </w:r>
+      <w:proofErr w:type="spellStart"/>
       <w:r>
         <w:rPr>
           <w:rFonts w:hint="eastAsia"/>
         </w:rPr>
         <w:t>TopicBus</w:t>
       </w:r>
+      <w:proofErr w:type="spellEnd"/>
       <w:r>
         <w:rPr>
           <w:rFonts w:hint="eastAsia"/>
@@ -7386,12 +7784,14 @@
         </w:rPr>
         <w:t>、</w:t>
       </w:r>
+      <w:proofErr w:type="spellStart"/>
       <w:r>
         <w:rPr>
           <w:rFonts w:hint="eastAsia"/>
         </w:rPr>
         <w:t>SubProto</w:t>
       </w:r>
+      <w:proofErr w:type="spellEnd"/>
       <w:r>
         <w:rPr>
           <w:rFonts w:hint="eastAsia"/>
@@ -7534,7 +7934,21 @@
         <w:rPr>
           <w:rFonts w:hint="eastAsia"/>
         </w:rPr>
-        <w:t>工程实现与部署分析”的主线展开。首先，根据个人物联网场景对本地部署、分层组网和多功能节点的需求，明确系统需要解决的关键问题；其次，在总体架构层面界定</w:t>
+        <w:t>工程实现与部署分析”的主线展开。首先，根据</w:t>
+      </w:r>
+      <w:proofErr w:type="gramStart"/>
+      <w:r>
+        <w:rPr>
+          <w:rFonts w:hint="eastAsia"/>
+        </w:rPr>
+        <w:t>个</w:t>
+      </w:r>
+      <w:proofErr w:type="gramEnd"/>
+      <w:r>
+        <w:rPr>
+          <w:rFonts w:hint="eastAsia"/>
+        </w:rPr>
+        <w:t>人物联网场景对本地部署、分层组网和多功能节点的需求，明确系统需要解决的关键问题；其次，在总体架构层面界定</w:t>
       </w:r>
       <w:r>
         <w:rPr>
@@ -7546,7 +7960,35 @@
         <w:rPr>
           <w:rFonts w:hint="eastAsia"/>
         </w:rPr>
-        <w:t>、子协议与宿主系统之间的边界；随后，对收发链路、路由语义、身份认证和权限控制等关键机制进行设计；在此基础上，分别说明各子协议的职责和接口；最后结合当前项目的工程结构，总结系统实现方式、部署形态和典型使用链路。</w:t>
+        <w:t>、</w:t>
+      </w:r>
+      <w:proofErr w:type="gramStart"/>
+      <w:r>
+        <w:rPr>
+          <w:rFonts w:hint="eastAsia"/>
+        </w:rPr>
+        <w:t>子协议</w:t>
+      </w:r>
+      <w:proofErr w:type="gramEnd"/>
+      <w:r>
+        <w:rPr>
+          <w:rFonts w:hint="eastAsia"/>
+        </w:rPr>
+        <w:t>与宿主系统之间的边界；随后，对收发链路、路由语义、身份认证和权限控制等关键机制进行设计；在此基础上，分别说明各</w:t>
+      </w:r>
+      <w:proofErr w:type="gramStart"/>
+      <w:r>
+        <w:rPr>
+          <w:rFonts w:hint="eastAsia"/>
+        </w:rPr>
+        <w:t>子协议</w:t>
+      </w:r>
+      <w:proofErr w:type="gramEnd"/>
+      <w:r>
+        <w:rPr>
+          <w:rFonts w:hint="eastAsia"/>
+        </w:rPr>
+        <w:t>的职责和接口；最后结合当前项目的工程结构，总结系统实现方式、部署形态和典型使用链路。</w:t>
       </w:r>
     </w:p>
     <w:p>
@@ -7592,11 +8034,19 @@
         </w:rPr>
         <w:t>3</w:t>
       </w:r>
-      <w:r>
-        <w:rPr>
-          <w:rFonts w:hint="eastAsia"/>
-        </w:rPr>
-        <w:t>章重点阐述系统的核心通信框架和树形路由机制；第</w:t>
+      <w:proofErr w:type="gramStart"/>
+      <w:r>
+        <w:rPr>
+          <w:rFonts w:hint="eastAsia"/>
+        </w:rPr>
+        <w:t>章重点</w:t>
+      </w:r>
+      <w:proofErr w:type="gramEnd"/>
+      <w:r>
+        <w:rPr>
+          <w:rFonts w:hint="eastAsia"/>
+        </w:rPr>
+        <w:t>阐述系统的核心通信框架和树形路由机制；第</w:t>
       </w:r>
       <w:r>
         <w:rPr>
@@ -7620,7 +8070,21 @@
         <w:rPr>
           <w:rFonts w:hint="eastAsia"/>
         </w:rPr>
-        <w:t>章围绕各个子协议展开说明；第</w:t>
+        <w:t>章围绕各个</w:t>
+      </w:r>
+      <w:proofErr w:type="gramStart"/>
+      <w:r>
+        <w:rPr>
+          <w:rFonts w:hint="eastAsia"/>
+        </w:rPr>
+        <w:t>子协议</w:t>
+      </w:r>
+      <w:proofErr w:type="gramEnd"/>
+      <w:r>
+        <w:rPr>
+          <w:rFonts w:hint="eastAsia"/>
+        </w:rPr>
+        <w:t>展开说明；第</w:t>
       </w:r>
       <w:r>
         <w:rPr>
@@ -7640,11 +8104,19 @@
         </w:rPr>
         <w:t>7</w:t>
       </w:r>
-      <w:r>
-        <w:rPr>
-          <w:rFonts w:hint="eastAsia"/>
-        </w:rPr>
-        <w:t>章总结全文工作并讨论后续改进方向。</w:t>
+      <w:proofErr w:type="gramStart"/>
+      <w:r>
+        <w:rPr>
+          <w:rFonts w:hint="eastAsia"/>
+        </w:rPr>
+        <w:t>章总结</w:t>
+      </w:r>
+      <w:proofErr w:type="gramEnd"/>
+      <w:r>
+        <w:rPr>
+          <w:rFonts w:hint="eastAsia"/>
+        </w:rPr>
+        <w:t>全文工作并讨论后续改进方向。</w:t>
       </w:r>
     </w:p>
     <w:p>
@@ -7774,11 +8246,61 @@
           <w:rFonts w:hint="eastAsia"/>
         </w:rPr>
       </w:pPr>
-      <w:r>
-        <w:rPr>
-          <w:rFonts w:hint="eastAsia"/>
-        </w:rPr>
-        <w:t>个人物联网平台主要面向家庭、个人实验室、小型工作室和轻量边缘环境等场景。这类场景中的设备规模通常不大，但设备类型差异明显，既可能包括桌面端、移动端和本地服务端，也可能包括传感器、执行器、屏显终端和临时接入节点。与企业级平台相比，个人物联网更强调用户能够自行在本地搭建、扩展和维护系统，因此平台应尽量降低对外部云中心的依赖。</w:t>
+      <w:proofErr w:type="gramStart"/>
+      <w:r>
+        <w:rPr>
+          <w:rFonts w:hint="eastAsia"/>
+        </w:rPr>
+        <w:t>个</w:t>
+      </w:r>
+      <w:proofErr w:type="gramEnd"/>
+      <w:r>
+        <w:rPr>
+          <w:rFonts w:hint="eastAsia"/>
+        </w:rPr>
+        <w:t>人物联网平台主要面向家庭、个人实验室、小型工作室和轻量边缘环境等场景。这类场景中的设备规模通常不大，但设备类型差异明显，既可能包括桌面端、移动端和本地服务端，也可能包括传感器、执行器、</w:t>
+      </w:r>
+      <w:proofErr w:type="gramStart"/>
+      <w:r>
+        <w:rPr>
+          <w:rFonts w:hint="eastAsia"/>
+        </w:rPr>
+        <w:t>屏显终端</w:t>
+      </w:r>
+      <w:proofErr w:type="gramEnd"/>
+      <w:r>
+        <w:rPr>
+          <w:rFonts w:hint="eastAsia"/>
+        </w:rPr>
+        <w:t>和临时接入节点。与企业级平台相比，</w:t>
+      </w:r>
+      <w:proofErr w:type="gramStart"/>
+      <w:r>
+        <w:rPr>
+          <w:rFonts w:hint="eastAsia"/>
+        </w:rPr>
+        <w:t>个</w:t>
+      </w:r>
+      <w:proofErr w:type="gramEnd"/>
+      <w:r>
+        <w:rPr>
+          <w:rFonts w:hint="eastAsia"/>
+        </w:rPr>
+        <w:t>人物联网更强调用户能够自行在本地搭建、扩展和维护系统，因此平台应尽量降低对外部</w:t>
+      </w:r>
+      <w:proofErr w:type="gramStart"/>
+      <w:r>
+        <w:rPr>
+          <w:rFonts w:hint="eastAsia"/>
+        </w:rPr>
+        <w:t>云中心</w:t>
+      </w:r>
+      <w:proofErr w:type="gramEnd"/>
+      <w:r>
+        <w:rPr>
+          <w:rFonts w:hint="eastAsia"/>
+        </w:rPr>
+        <w:t>的依赖。</w:t>
       </w:r>
     </w:p>
     <w:p>
@@ -7803,7 +8325,21 @@
         <w:rPr>
           <w:rFonts w:hint="eastAsia"/>
         </w:rPr>
-        <w:t>基于上述场景，本文所关注的问题主要体现在三个层面。第一，如何在统一的消息头和路由语义下，使消息在树形网络中完成“上报、转发、命中、回程”的完整过程；第二，如何在多跳环境中确认节点身份、阻止来源伪造，并使不同子树中的资源能够在局部自治前提下被授权访问；第三，如何在统一通信框架上承载变量、事件、文件、流程和能力调用等上层功能，而不是为每一种能力分别设计互不兼容的链路。</w:t>
+        <w:t>基于上述场景，本文所关注的问题主要体现在三个层面。第一，如何在统一的消息头和路由语义下，使消息在树形网络中完成“上报、转发、命中、回程”的完整过程；第二，如何在多</w:t>
+      </w:r>
+      <w:proofErr w:type="gramStart"/>
+      <w:r>
+        <w:rPr>
+          <w:rFonts w:hint="eastAsia"/>
+        </w:rPr>
+        <w:t>跳环境</w:t>
+      </w:r>
+      <w:proofErr w:type="gramEnd"/>
+      <w:r>
+        <w:rPr>
+          <w:rFonts w:hint="eastAsia"/>
+        </w:rPr>
+        <w:t>中确认节点身份、阻止来源伪造，并使不同子树中的资源能够在局部自治前提下被授权访问；第三，如何在统一通信框架上承载变量、事件、文件、流程和能力调用等上层功能，而不是为每一种能力分别设计互不兼容的链路。</w:t>
       </w:r>
     </w:p>
     <w:p>
@@ -7846,7 +8382,21 @@
         <w:rPr>
           <w:rFonts w:hint="eastAsia"/>
         </w:rPr>
-        <w:t>从功能层面看，系统至少需要满足三类核心需求。第一类是节点准入与身份管理需求，包括设备注册、登录、凭据查询、审批准入、绑定撤销和离线通知等。第二类是拓扑与连接管理需求，包括父链连接、子节点维护、节点显示信息读取、子树浏览和局部管理。第三类是数据交换需求，包括变量读写、主题事件发布与</w:t>
+        <w:t>从功能层面看，系统至少需要满足三类核心需求。第一类是节点准入与身份管理需求，包括设备注册、登录、凭据查询、审批准入、绑定撤销和离线通知等。第二类是拓扑与连接管理需求，</w:t>
+      </w:r>
+      <w:proofErr w:type="gramStart"/>
+      <w:r>
+        <w:rPr>
+          <w:rFonts w:hint="eastAsia"/>
+        </w:rPr>
+        <w:t>包括父链连接</w:t>
+      </w:r>
+      <w:proofErr w:type="gramEnd"/>
+      <w:r>
+        <w:rPr>
+          <w:rFonts w:hint="eastAsia"/>
+        </w:rPr>
+        <w:t>、子节点维护、节点显示信息读取、子树浏览和局部管理。第三类是数据交换需求，包括变量读写、主题事件发布与</w:t>
       </w:r>
       <w:r>
         <w:rPr>
@@ -7903,7 +8453,21 @@
         <w:rPr>
           <w:rFonts w:hint="eastAsia"/>
         </w:rPr>
-        <w:t>桌面端为例，平台不仅应允许用户连接既有</w:t>
+        <w:t>桌面端为例，平台不仅应允</w:t>
+      </w:r>
+      <w:proofErr w:type="gramStart"/>
+      <w:r>
+        <w:rPr>
+          <w:rFonts w:hint="eastAsia"/>
+        </w:rPr>
+        <w:t>许用户</w:t>
+      </w:r>
+      <w:proofErr w:type="gramEnd"/>
+      <w:r>
+        <w:rPr>
+          <w:rFonts w:hint="eastAsia"/>
+        </w:rPr>
+        <w:t>连接既有</w:t>
       </w:r>
       <w:r>
         <w:rPr>
@@ -7995,13 +8559,55 @@
         <w:rPr>
           <w:rFonts w:hint="eastAsia"/>
         </w:rPr>
-        <w:t xml:space="preserve"> exec.call </w:t>
-      </w:r>
-      <w:r>
-        <w:rPr>
-          <w:rFonts w:hint="eastAsia"/>
-        </w:rPr>
-        <w:t>等敏感控制动作；其二，部分响应或数据面帧更适合采用目标导向的快速转发，以降低中间节点的处理负担；其三，不同子协议虽然承担的功能不同，但都应遵循统一的消息</w:t>
+        <w:t xml:space="preserve"> </w:t>
+      </w:r>
+      <w:proofErr w:type="spellStart"/>
+      <w:r>
+        <w:rPr>
+          <w:rFonts w:hint="eastAsia"/>
+        </w:rPr>
+        <w:t>exec.call</w:t>
+      </w:r>
+      <w:proofErr w:type="spellEnd"/>
+      <w:r>
+        <w:rPr>
+          <w:rFonts w:hint="eastAsia"/>
+        </w:rPr>
+        <w:t xml:space="preserve"> </w:t>
+      </w:r>
+      <w:r>
+        <w:rPr>
+          <w:rFonts w:hint="eastAsia"/>
+        </w:rPr>
+        <w:t>等敏感控制动作；其二，部分响应或数据</w:t>
+      </w:r>
+      <w:proofErr w:type="gramStart"/>
+      <w:r>
+        <w:rPr>
+          <w:rFonts w:hint="eastAsia"/>
+        </w:rPr>
+        <w:t>面帧更</w:t>
+      </w:r>
+      <w:proofErr w:type="gramEnd"/>
+      <w:r>
+        <w:rPr>
+          <w:rFonts w:hint="eastAsia"/>
+        </w:rPr>
+        <w:t>适合采用目标导向的快速转发，以降低中间节点的处理负担；其三，不同</w:t>
+      </w:r>
+      <w:proofErr w:type="gramStart"/>
+      <w:r>
+        <w:rPr>
+          <w:rFonts w:hint="eastAsia"/>
+        </w:rPr>
+        <w:t>子协议</w:t>
+      </w:r>
+      <w:proofErr w:type="gramEnd"/>
+      <w:r>
+        <w:rPr>
+          <w:rFonts w:hint="eastAsia"/>
+        </w:rPr>
+        <w:t>虽然承担的功能不同，但都应遵循统一的消息</w:t>
       </w:r>
       <w:r>
         <w:rPr>
@@ -8013,7 +8619,21 @@
         <w:rPr>
           <w:rFonts w:hint="eastAsia"/>
         </w:rPr>
-        <w:t>和清晰的请求响应语义，避免系统随功能扩展而不断碎片化。</w:t>
+        <w:t>和清晰的请求响应语义，避免系统</w:t>
+      </w:r>
+      <w:proofErr w:type="gramStart"/>
+      <w:r>
+        <w:rPr>
+          <w:rFonts w:hint="eastAsia"/>
+        </w:rPr>
+        <w:t>随功能</w:t>
+      </w:r>
+      <w:proofErr w:type="gramEnd"/>
+      <w:r>
+        <w:rPr>
+          <w:rFonts w:hint="eastAsia"/>
+        </w:rPr>
+        <w:t>扩展而不断碎片化。</w:t>
       </w:r>
     </w:p>
     <w:p>
@@ -8062,7 +8682,21 @@
         <w:rPr>
           <w:rFonts w:hint="eastAsia"/>
         </w:rPr>
-        <w:t>除功能需求外，系统还需要满足若干非功能要求。首先是可扩展性。由于个人物联网场景中的设备形态变化较快，平台应尽量避免将某一种宿主形式或持久化方式固化在架构中，而应通过清晰的模块边界保持协议、运行时和宿主应用之间的分层关系。其次是可维护性，即系统能够在不破坏既有</w:t>
+        <w:t>除功能需求外，系统还需要满足若干非功能要求。首先是可扩展性。由于</w:t>
+      </w:r>
+      <w:proofErr w:type="gramStart"/>
+      <w:r>
+        <w:rPr>
+          <w:rFonts w:hint="eastAsia"/>
+        </w:rPr>
+        <w:t>个</w:t>
+      </w:r>
+      <w:proofErr w:type="gramEnd"/>
+      <w:r>
+        <w:rPr>
+          <w:rFonts w:hint="eastAsia"/>
+        </w:rPr>
+        <w:t>人物联网场景中的设备形态变化较快，平台应尽量避免将某一种宿主形式或持久化方式固化在架构中，而应通过清晰的模块边界保持协议、运行时和宿主应用之间的分层关系。其次是可维护性，即系统能够在不破坏既有</w:t>
       </w:r>
       <w:r>
         <w:rPr>
@@ -8074,7 +8708,21 @@
         <w:rPr>
           <w:rFonts w:hint="eastAsia"/>
         </w:rPr>
-        <w:t>语义的前提下，逐步演进子协议实现和模块归属。</w:t>
+        <w:t>语义的前提下，逐步演进</w:t>
+      </w:r>
+      <w:proofErr w:type="gramStart"/>
+      <w:r>
+        <w:rPr>
+          <w:rFonts w:hint="eastAsia"/>
+        </w:rPr>
+        <w:t>子协议</w:t>
+      </w:r>
+      <w:proofErr w:type="gramEnd"/>
+      <w:r>
+        <w:rPr>
+          <w:rFonts w:hint="eastAsia"/>
+        </w:rPr>
+        <w:t>实现和模块归属。</w:t>
       </w:r>
     </w:p>
     <w:p>
@@ -8088,7 +8736,35 @@
         <w:rPr>
           <w:rFonts w:hint="eastAsia"/>
         </w:rPr>
-        <w:t>其次是可靠性。树形网络中的任意一跳都可能成为消息转发点，因此系统必须控制消息的转发路径、跳数和来源校验方式，避免因连接异常、父链断开或节点冒充导致链路混乱。对于本地部署场景，系统还需要给出明确的失败语义，例如</w:t>
+        <w:t>其次是可靠性。树形网络中的任意一跳都可能成为消息转发点，因此系统必须控制消息的转发路径、</w:t>
+      </w:r>
+      <w:proofErr w:type="gramStart"/>
+      <w:r>
+        <w:rPr>
+          <w:rFonts w:hint="eastAsia"/>
+        </w:rPr>
+        <w:t>跳数和</w:t>
+      </w:r>
+      <w:proofErr w:type="gramEnd"/>
+      <w:r>
+        <w:rPr>
+          <w:rFonts w:hint="eastAsia"/>
+        </w:rPr>
+        <w:t>来源校验方式，避免因连接异常、</w:t>
+      </w:r>
+      <w:proofErr w:type="gramStart"/>
+      <w:r>
+        <w:rPr>
+          <w:rFonts w:hint="eastAsia"/>
+        </w:rPr>
+        <w:t>父链断开</w:t>
+      </w:r>
+      <w:proofErr w:type="gramEnd"/>
+      <w:r>
+        <w:rPr>
+          <w:rFonts w:hint="eastAsia"/>
+        </w:rPr>
+        <w:t>或节点冒充导致链路混乱。对于本地部署场景，系统还需要给出明确的失败语义，例如</w:t>
       </w:r>
       <w:r>
         <w:rPr>
@@ -8123,7 +8799,35 @@
         <w:rPr>
           <w:rFonts w:hint="eastAsia"/>
         </w:rPr>
-        <w:t>变量、文件写入和流程设置不应被未授权主体任意调用。同时，系统还应能够既作为服务端运行时稳定存在，又能以桌面平台、移动宿主或专用节点形式接入统一协议栈。</w:t>
+        <w:t>变量、文件写入和流程设置不应被未授权主体任意调用。同时，系统还应能够既作为服务</w:t>
+      </w:r>
+      <w:proofErr w:type="gramStart"/>
+      <w:r>
+        <w:rPr>
+          <w:rFonts w:hint="eastAsia"/>
+        </w:rPr>
+        <w:t>端运行</w:t>
+      </w:r>
+      <w:proofErr w:type="gramEnd"/>
+      <w:r>
+        <w:rPr>
+          <w:rFonts w:hint="eastAsia"/>
+        </w:rPr>
+        <w:t>时稳定存在，又能以桌面平台、移动宿主或专用节点形式接入统一协议</w:t>
+      </w:r>
+      <w:proofErr w:type="gramStart"/>
+      <w:r>
+        <w:rPr>
+          <w:rFonts w:hint="eastAsia"/>
+        </w:rPr>
+        <w:t>栈</w:t>
+      </w:r>
+      <w:proofErr w:type="gramEnd"/>
+      <w:r>
+        <w:rPr>
+          <w:rFonts w:hint="eastAsia"/>
+        </w:rPr>
+        <w:t>。</w:t>
       </w:r>
     </w:p>
     <w:p>
@@ -8167,19 +8871,61 @@
         <w:rPr>
           <w:rFonts w:hint="eastAsia"/>
         </w:rPr>
-        <w:t>根据当前项目的工程分层，系统总体可划分为协议字典层、核心框架层、客户端能力层、子协议实现层、服务端装配层和宿主应用层六个部分。协议字典层由</w:t>
-      </w:r>
-      <w:r>
-        <w:rPr>
-          <w:rFonts w:hint="eastAsia"/>
-        </w:rPr>
-        <w:t xml:space="preserve"> MyFlowHub-Proto </w:t>
-      </w:r>
-      <w:r>
-        <w:rPr>
-          <w:rFonts w:hint="eastAsia"/>
-        </w:rPr>
-        <w:t>承担，负责定义各子协议的</w:t>
+        <w:t>根据当前项目的工程分层，系统总体可划分为协议字典层、核心框架层、客户端能力层、</w:t>
+      </w:r>
+      <w:proofErr w:type="gramStart"/>
+      <w:r>
+        <w:rPr>
+          <w:rFonts w:hint="eastAsia"/>
+        </w:rPr>
+        <w:t>子协议</w:t>
+      </w:r>
+      <w:proofErr w:type="gramEnd"/>
+      <w:r>
+        <w:rPr>
+          <w:rFonts w:hint="eastAsia"/>
+        </w:rPr>
+        <w:t>实现层、服务端装配层和宿主应用层六个部分。协议字典层由</w:t>
+      </w:r>
+      <w:r>
+        <w:rPr>
+          <w:rFonts w:hint="eastAsia"/>
+        </w:rPr>
+        <w:t xml:space="preserve"> </w:t>
+      </w:r>
+      <w:proofErr w:type="spellStart"/>
+      <w:r>
+        <w:rPr>
+          <w:rFonts w:hint="eastAsia"/>
+        </w:rPr>
+        <w:t>MyFlowHub</w:t>
+      </w:r>
+      <w:proofErr w:type="spellEnd"/>
+      <w:r>
+        <w:rPr>
+          <w:rFonts w:hint="eastAsia"/>
+        </w:rPr>
+        <w:t xml:space="preserve">-Proto </w:t>
+      </w:r>
+      <w:r>
+        <w:rPr>
+          <w:rFonts w:hint="eastAsia"/>
+        </w:rPr>
+        <w:t>承担，负责定义各</w:t>
+      </w:r>
+      <w:proofErr w:type="gramStart"/>
+      <w:r>
+        <w:rPr>
+          <w:rFonts w:hint="eastAsia"/>
+        </w:rPr>
+        <w:t>子协议</w:t>
+      </w:r>
+      <w:proofErr w:type="gramEnd"/>
+      <w:r>
+        <w:rPr>
+          <w:rFonts w:hint="eastAsia"/>
+        </w:rPr>
+        <w:t>的</w:t>
       </w:r>
       <w:r>
         <w:rPr>
@@ -8257,7 +9003,21 @@
         <w:rPr>
           <w:rFonts w:hint="eastAsia"/>
         </w:rPr>
-        <w:t xml:space="preserve"> MyFlowHub-SDK </w:t>
+        <w:t xml:space="preserve"> </w:t>
+      </w:r>
+      <w:proofErr w:type="spellStart"/>
+      <w:r>
+        <w:rPr>
+          <w:rFonts w:hint="eastAsia"/>
+        </w:rPr>
+        <w:t>MyFlowHub</w:t>
+      </w:r>
+      <w:proofErr w:type="spellEnd"/>
+      <w:r>
+        <w:rPr>
+          <w:rFonts w:hint="eastAsia"/>
+        </w:rPr>
+        <w:t xml:space="preserve">-SDK </w:t>
       </w:r>
       <w:r>
         <w:rPr>
@@ -8279,17 +9039,39 @@
         </w:rPr>
         <w:t>在此基础上，</w:t>
       </w:r>
-      <w:r>
-        <w:rPr>
-          <w:rFonts w:hint="eastAsia"/>
-        </w:rPr>
-        <w:t xml:space="preserve">MyFlowHub-SubProto </w:t>
-      </w:r>
-      <w:r>
-        <w:rPr>
-          <w:rFonts w:hint="eastAsia"/>
-        </w:rPr>
-        <w:t>负责承载具体子协议实现模块，例如</w:t>
+      <w:proofErr w:type="spellStart"/>
+      <w:r>
+        <w:rPr>
+          <w:rFonts w:hint="eastAsia"/>
+        </w:rPr>
+        <w:t>MyFlowHub-SubProto</w:t>
+      </w:r>
+      <w:proofErr w:type="spellEnd"/>
+      <w:r>
+        <w:rPr>
+          <w:rFonts w:hint="eastAsia"/>
+        </w:rPr>
+        <w:t xml:space="preserve"> </w:t>
+      </w:r>
+      <w:r>
+        <w:rPr>
+          <w:rFonts w:hint="eastAsia"/>
+        </w:rPr>
+        <w:t>负责承载具体</w:t>
+      </w:r>
+      <w:proofErr w:type="gramStart"/>
+      <w:r>
+        <w:rPr>
+          <w:rFonts w:hint="eastAsia"/>
+        </w:rPr>
+        <w:t>子协议</w:t>
+      </w:r>
+      <w:proofErr w:type="gramEnd"/>
+      <w:r>
+        <w:rPr>
+          <w:rFonts w:hint="eastAsia"/>
+        </w:rPr>
+        <w:t>实现模块，例如</w:t>
       </w:r>
       <w:r>
         <w:rPr>
@@ -8303,24 +9085,28 @@
         </w:rPr>
         <w:t>、</w:t>
       </w:r>
+      <w:proofErr w:type="spellStart"/>
       <w:r>
         <w:rPr>
           <w:rFonts w:hint="eastAsia"/>
         </w:rPr>
         <w:t>varstore</w:t>
       </w:r>
+      <w:proofErr w:type="spellEnd"/>
       <w:r>
         <w:rPr>
           <w:rFonts w:hint="eastAsia"/>
         </w:rPr>
         <w:t>、</w:t>
       </w:r>
+      <w:proofErr w:type="spellStart"/>
       <w:r>
         <w:rPr>
           <w:rFonts w:hint="eastAsia"/>
         </w:rPr>
         <w:t>topicbus</w:t>
       </w:r>
+      <w:proofErr w:type="spellEnd"/>
       <w:r>
         <w:rPr>
           <w:rFonts w:hint="eastAsia"/>
@@ -8363,11 +9149,19 @@
         </w:rPr>
         <w:t>等；</w:t>
       </w:r>
-      <w:r>
-        <w:rPr>
-          <w:rFonts w:hint="eastAsia"/>
-        </w:rPr>
-        <w:t xml:space="preserve">MyFlowHub-Server </w:t>
+      <w:proofErr w:type="spellStart"/>
+      <w:r>
+        <w:rPr>
+          <w:rFonts w:hint="eastAsia"/>
+        </w:rPr>
+        <w:t>MyFlowHub</w:t>
+      </w:r>
+      <w:proofErr w:type="spellEnd"/>
+      <w:r>
+        <w:rPr>
+          <w:rFonts w:hint="eastAsia"/>
+        </w:rPr>
+        <w:t xml:space="preserve">-Server </w:t>
       </w:r>
       <w:r>
         <w:rPr>
@@ -8391,7 +9185,21 @@
         <w:rPr>
           <w:rFonts w:hint="eastAsia"/>
         </w:rPr>
-        <w:t xml:space="preserve"> MyFlowHub-Win</w:t>
+        <w:t xml:space="preserve"> </w:t>
+      </w:r>
+      <w:proofErr w:type="spellStart"/>
+      <w:r>
+        <w:rPr>
+          <w:rFonts w:hint="eastAsia"/>
+        </w:rPr>
+        <w:t>MyFlowHub</w:t>
+      </w:r>
+      <w:proofErr w:type="spellEnd"/>
+      <w:r>
+        <w:rPr>
+          <w:rFonts w:hint="eastAsia"/>
+        </w:rPr>
+        <w:t>-Win</w:t>
       </w:r>
       <w:r>
         <w:rPr>
@@ -8399,11 +9207,19 @@
         </w:rPr>
         <w:t>、</w:t>
       </w:r>
-      <w:r>
-        <w:rPr>
-          <w:rFonts w:hint="eastAsia"/>
-        </w:rPr>
-        <w:t>MyFlowHub-Android</w:t>
+      <w:proofErr w:type="spellStart"/>
+      <w:r>
+        <w:rPr>
+          <w:rFonts w:hint="eastAsia"/>
+        </w:rPr>
+        <w:t>MyFlowHub</w:t>
+      </w:r>
+      <w:proofErr w:type="spellEnd"/>
+      <w:r>
+        <w:rPr>
+          <w:rFonts w:hint="eastAsia"/>
+        </w:rPr>
+        <w:t>-Android</w:t>
       </w:r>
       <w:r>
         <w:rPr>
@@ -8411,11 +9227,19 @@
         </w:rPr>
         <w:t>、</w:t>
       </w:r>
-      <w:r>
-        <w:rPr>
-          <w:rFonts w:hint="eastAsia"/>
-        </w:rPr>
-        <w:t xml:space="preserve">MyFlowHub-MetricsNode </w:t>
+      <w:proofErr w:type="spellStart"/>
+      <w:r>
+        <w:rPr>
+          <w:rFonts w:hint="eastAsia"/>
+        </w:rPr>
+        <w:t>MyFlowHub-MetricsNode</w:t>
+      </w:r>
+      <w:proofErr w:type="spellEnd"/>
+      <w:r>
+        <w:rPr>
+          <w:rFonts w:hint="eastAsia"/>
+        </w:rPr>
+        <w:t xml:space="preserve"> </w:t>
       </w:r>
       <w:r>
         <w:rPr>
@@ -8445,7 +9269,21 @@
         <w:rPr>
           <w:rFonts w:hint="eastAsia"/>
         </w:rPr>
-        <w:t>和服务端能力访问系统，而不是在</w:t>
+        <w:t>和服务</w:t>
+      </w:r>
+      <w:proofErr w:type="gramStart"/>
+      <w:r>
+        <w:rPr>
+          <w:rFonts w:hint="eastAsia"/>
+        </w:rPr>
+        <w:t>端能力</w:t>
+      </w:r>
+      <w:proofErr w:type="gramEnd"/>
+      <w:r>
+        <w:rPr>
+          <w:rFonts w:hint="eastAsia"/>
+        </w:rPr>
+        <w:t>访问系统，而不是在</w:t>
       </w:r>
       <w:r>
         <w:rPr>
@@ -8457,7 +9295,21 @@
         <w:rPr>
           <w:rFonts w:hint="eastAsia"/>
         </w:rPr>
-        <w:t>层重复实现服务端内部机制。</w:t>
+        <w:t>层重复实现服务</w:t>
+      </w:r>
+      <w:proofErr w:type="gramStart"/>
+      <w:r>
+        <w:rPr>
+          <w:rFonts w:hint="eastAsia"/>
+        </w:rPr>
+        <w:t>端内部</w:t>
+      </w:r>
+      <w:proofErr w:type="gramEnd"/>
+      <w:r>
+        <w:rPr>
+          <w:rFonts w:hint="eastAsia"/>
+        </w:rPr>
+        <w:t>机制。</w:t>
       </w:r>
     </w:p>
     <w:p>
@@ -8468,7 +9320,49 @@
         <w:rPr>
           <w:rFonts w:hint="eastAsia"/>
         </w:rPr>
-        <w:t>这种分层体现了“协议与运行时分离、实现与宿主分离”的基本思路。换言之，消息头部如何表达、子协议动作如何命名、服务端如何装配运行时、桌面端如何提供本地管理入口，这些问题虽然彼此关联，但不应被混杂在同一层中。通过明确的模块边界，系统可以在保证</w:t>
+        <w:t>这种分层体现了“协议与运行时分离、实现与宿主分离”的基本思路。换言之，消息头部如何表达、</w:t>
+      </w:r>
+      <w:proofErr w:type="gramStart"/>
+      <w:r>
+        <w:rPr>
+          <w:rFonts w:hint="eastAsia"/>
+        </w:rPr>
+        <w:t>子协议</w:t>
+      </w:r>
+      <w:proofErr w:type="gramEnd"/>
+      <w:r>
+        <w:rPr>
+          <w:rFonts w:hint="eastAsia"/>
+        </w:rPr>
+        <w:t>动作如何命名、服务</w:t>
+      </w:r>
+      <w:proofErr w:type="gramStart"/>
+      <w:r>
+        <w:rPr>
+          <w:rFonts w:hint="eastAsia"/>
+        </w:rPr>
+        <w:t>端如何</w:t>
+      </w:r>
+      <w:proofErr w:type="gramEnd"/>
+      <w:r>
+        <w:rPr>
+          <w:rFonts w:hint="eastAsia"/>
+        </w:rPr>
+        <w:t>装配运行时、桌面</w:t>
+      </w:r>
+      <w:proofErr w:type="gramStart"/>
+      <w:r>
+        <w:rPr>
+          <w:rFonts w:hint="eastAsia"/>
+        </w:rPr>
+        <w:t>端如何</w:t>
+      </w:r>
+      <w:proofErr w:type="gramEnd"/>
+      <w:r>
+        <w:rPr>
+          <w:rFonts w:hint="eastAsia"/>
+        </w:rPr>
+        <w:t>提供本地管理入口，这些问题虽然彼此关联，但不应被混杂在同一层中。通过明确的模块边界，系统可以在保证</w:t>
       </w:r>
       <w:r>
         <w:rPr>
@@ -8523,7 +9417,21 @@
         <w:rPr>
           <w:rFonts w:hint="eastAsia"/>
         </w:rPr>
-        <w:t>在总体设计中，系统作出了若干关键取舍。首先，在消息语义上坚持稳定</w:t>
+        <w:t>在总体设计中，系统</w:t>
+      </w:r>
+      <w:proofErr w:type="gramStart"/>
+      <w:r>
+        <w:rPr>
+          <w:rFonts w:hint="eastAsia"/>
+        </w:rPr>
+        <w:t>作出</w:t>
+      </w:r>
+      <w:proofErr w:type="gramEnd"/>
+      <w:r>
+        <w:rPr>
+          <w:rFonts w:hint="eastAsia"/>
+        </w:rPr>
+        <w:t>了若干关键取舍。首先，在消息语义上坚持稳定</w:t>
       </w:r>
       <w:r>
         <w:rPr>
@@ -8541,7 +9449,21 @@
         <w:rPr>
           <w:rFonts w:hint="eastAsia"/>
         </w:rPr>
-        <w:t xml:space="preserve"> SubProto </w:t>
+        <w:t xml:space="preserve"> </w:t>
+      </w:r>
+      <w:proofErr w:type="spellStart"/>
+      <w:r>
+        <w:rPr>
+          <w:rFonts w:hint="eastAsia"/>
+        </w:rPr>
+        <w:t>SubProto</w:t>
+      </w:r>
+      <w:proofErr w:type="spellEnd"/>
+      <w:r>
+        <w:rPr>
+          <w:rFonts w:hint="eastAsia"/>
+        </w:rPr>
+        <w:t xml:space="preserve"> </w:t>
       </w:r>
       <w:r>
         <w:rPr>
@@ -8571,7 +9493,21 @@
         <w:rPr>
           <w:rFonts w:hint="eastAsia"/>
         </w:rPr>
-        <w:t>载荷结构稳定，将演进成本控制在实现层和装配层，而不是频繁调整协议字典。这一选择有利于多宿主复用，但也意味着新能力引入时必须充分考虑向后兼容。</w:t>
+        <w:t>载荷结构稳定，将演进成本控制在实现层和装配层，而不是频繁调整协议字典。这一选择有利于多宿主复用，但也意味着</w:t>
+      </w:r>
+      <w:proofErr w:type="gramStart"/>
+      <w:r>
+        <w:rPr>
+          <w:rFonts w:hint="eastAsia"/>
+        </w:rPr>
+        <w:t>新能力</w:t>
+      </w:r>
+      <w:proofErr w:type="gramEnd"/>
+      <w:r>
+        <w:rPr>
+          <w:rFonts w:hint="eastAsia"/>
+        </w:rPr>
+        <w:t>引入时必须充分考虑向后兼容。</w:t>
       </w:r>
     </w:p>
     <w:p>
@@ -8597,7 +9533,21 @@
         <w:rPr>
           <w:rFonts w:hint="eastAsia"/>
         </w:rPr>
-        <w:t>。原因在于，个人物联网平台更需要工程上易于落地和调试的统一判定接口。</w:t>
+        <w:t>。原因在于，</w:t>
+      </w:r>
+      <w:proofErr w:type="gramStart"/>
+      <w:r>
+        <w:rPr>
+          <w:rFonts w:hint="eastAsia"/>
+        </w:rPr>
+        <w:t>个</w:t>
+      </w:r>
+      <w:proofErr w:type="gramEnd"/>
+      <w:r>
+        <w:rPr>
+          <w:rFonts w:hint="eastAsia"/>
+        </w:rPr>
+        <w:t>人物联网平台更需要工程上易于落地和调试的统一判定接口。</w:t>
       </w:r>
       <w:r>
         <w:rPr>
@@ -8654,7 +9604,21 @@
         <w:rPr>
           <w:rFonts w:hint="eastAsia"/>
         </w:rPr>
-        <w:t>桌面端没有将完整</w:t>
+        <w:t>桌面</w:t>
+      </w:r>
+      <w:proofErr w:type="gramStart"/>
+      <w:r>
+        <w:rPr>
+          <w:rFonts w:hint="eastAsia"/>
+        </w:rPr>
+        <w:t>端没有</w:t>
+      </w:r>
+      <w:proofErr w:type="gramEnd"/>
+      <w:r>
+        <w:rPr>
+          <w:rFonts w:hint="eastAsia"/>
+        </w:rPr>
+        <w:t>将完整</w:t>
       </w:r>
       <w:r>
         <w:rPr>
@@ -8684,7 +9648,21 @@
         <w:rPr>
           <w:rFonts w:hint="eastAsia"/>
         </w:rPr>
-        <w:t xml:space="preserve"> hub_server </w:t>
+        <w:t xml:space="preserve"> </w:t>
+      </w:r>
+      <w:proofErr w:type="spellStart"/>
+      <w:r>
+        <w:rPr>
+          <w:rFonts w:hint="eastAsia"/>
+        </w:rPr>
+        <w:t>hub_server</w:t>
+      </w:r>
+      <w:proofErr w:type="spellEnd"/>
+      <w:r>
+        <w:rPr>
+          <w:rFonts w:hint="eastAsia"/>
+        </w:rPr>
+        <w:t xml:space="preserve"> </w:t>
       </w:r>
       <w:r>
         <w:rPr>
@@ -8702,7 +9680,21 @@
         <w:rPr>
           <w:rFonts w:hint="eastAsia"/>
         </w:rPr>
-        <w:t>子进程进行管理。这一取舍保留了桌面端作为控制台和运维入口的定位，避免</w:t>
+        <w:t>子进程进行管理。这一取舍保留了桌面</w:t>
+      </w:r>
+      <w:proofErr w:type="gramStart"/>
+      <w:r>
+        <w:rPr>
+          <w:rFonts w:hint="eastAsia"/>
+        </w:rPr>
+        <w:t>端作为</w:t>
+      </w:r>
+      <w:proofErr w:type="gramEnd"/>
+      <w:r>
+        <w:rPr>
+          <w:rFonts w:hint="eastAsia"/>
+        </w:rPr>
+        <w:t>控制台和运维入口的定位，避免</w:t>
       </w:r>
       <w:r>
         <w:rPr>
@@ -8714,7 +9706,21 @@
         <w:rPr>
           <w:rFonts w:hint="eastAsia"/>
         </w:rPr>
-        <w:t>宿主与服务端运行时完全耦合。其代价是需要额外处理下载、安装和进程生命周期，但系统边界更清晰，也更符合整体分层设计。</w:t>
+        <w:t>宿主与服务</w:t>
+      </w:r>
+      <w:proofErr w:type="gramStart"/>
+      <w:r>
+        <w:rPr>
+          <w:rFonts w:hint="eastAsia"/>
+        </w:rPr>
+        <w:t>端运行</w:t>
+      </w:r>
+      <w:proofErr w:type="gramEnd"/>
+      <w:r>
+        <w:rPr>
+          <w:rFonts w:hint="eastAsia"/>
+        </w:rPr>
+        <w:t>时完全耦合。其代价是需要额外处理下载、安装和进程生命周期，但系统边界更清晰，也更符合整体分层设计。</w:t>
       </w:r>
     </w:p>
     <w:p>
@@ -8869,7 +9875,21 @@
         <w:rPr>
           <w:rFonts w:hint="eastAsia"/>
         </w:rPr>
-        <w:t>本系统不预先将设备固定划分为“网关、中继、终端”三类角色，而是统一抽象为</w:t>
+        <w:t>本系统</w:t>
+      </w:r>
+      <w:proofErr w:type="gramStart"/>
+      <w:r>
+        <w:rPr>
+          <w:rFonts w:hint="eastAsia"/>
+        </w:rPr>
+        <w:t>不</w:t>
+      </w:r>
+      <w:proofErr w:type="gramEnd"/>
+      <w:r>
+        <w:rPr>
+          <w:rFonts w:hint="eastAsia"/>
+        </w:rPr>
+        <w:t>预先将设备固定划分为“网关、中继、终端”三类角色，而是统一抽象为</w:t>
       </w:r>
       <w:r>
         <w:rPr>
@@ -8899,8 +9919,16 @@
         <w:rPr>
           <w:rFonts w:hint="eastAsia"/>
         </w:rPr>
-        <w:t xml:space="preserve"> NodeID</w:t>
-      </w:r>
+        <w:t xml:space="preserve"> </w:t>
+      </w:r>
+      <w:proofErr w:type="spellStart"/>
+      <w:r>
+        <w:rPr>
+          <w:rFonts w:hint="eastAsia"/>
+        </w:rPr>
+        <w:t>NodeID</w:t>
+      </w:r>
+      <w:proofErr w:type="spellEnd"/>
       <w:r>
         <w:rPr>
           <w:rFonts w:hint="eastAsia"/>
@@ -8941,7 +9969,21 @@
         <w:rPr>
           <w:rFonts w:hint="eastAsia"/>
         </w:rPr>
-        <w:t>。需要强调的是，这些角色并非静态固化在硬件层，而是由部署方式和运行时能力共同决定。</w:t>
+        <w:t>。需要强调的是，这些角色并非静态固化在硬件层，而是由部署方式和运行</w:t>
+      </w:r>
+      <w:proofErr w:type="gramStart"/>
+      <w:r>
+        <w:rPr>
+          <w:rFonts w:hint="eastAsia"/>
+        </w:rPr>
+        <w:t>时能力</w:t>
+      </w:r>
+      <w:proofErr w:type="gramEnd"/>
+      <w:r>
+        <w:rPr>
+          <w:rFonts w:hint="eastAsia"/>
+        </w:rPr>
+        <w:t>共同决定。</w:t>
       </w:r>
     </w:p>
     <w:p>
@@ -8967,7 +10009,21 @@
         <w:rPr>
           <w:rFonts w:hint="eastAsia"/>
         </w:rPr>
-        <w:t>管理自己的子树，更轻量的传感器或执行器则作为叶子节点接入。与完全对等的网状结构相比，树形结构更便于控制管理边界；与单中心星型结构相比，它又更适合覆盖跨区域、多层级和多宿主场景。</w:t>
+        <w:t>管理自己的子树，更轻量的传感器或执行器则作为叶子节点接入。与完全对等的网状结构相比，树形结构更便于控制管理边界；与</w:t>
+      </w:r>
+      <w:proofErr w:type="gramStart"/>
+      <w:r>
+        <w:rPr>
+          <w:rFonts w:hint="eastAsia"/>
+        </w:rPr>
+        <w:t>单中心</w:t>
+      </w:r>
+      <w:proofErr w:type="gramEnd"/>
+      <w:r>
+        <w:rPr>
+          <w:rFonts w:hint="eastAsia"/>
+        </w:rPr>
+        <w:t>星型结构相比，它又更适合覆盖跨区域、多层级和多宿主场景。</w:t>
       </w:r>
     </w:p>
     <w:p>
@@ -8981,19 +10037,63 @@
         <w:rPr>
           <w:rFonts w:hint="eastAsia"/>
         </w:rPr>
-        <w:t>树形模型的另一项优势在于控制权和数据路径都具有明确方向性。节点既可以将请求沿父链逐级上送，也可以将控制结果沿子链逐级下发。这种方向性为后续的权限裁决、</w:t>
-      </w:r>
-      <w:r>
-        <w:rPr>
-          <w:rFonts w:hint="eastAsia"/>
-        </w:rPr>
-        <w:t xml:space="preserve">SourceID </w:t>
-      </w:r>
-      <w:r>
-        <w:rPr>
-          <w:rFonts w:hint="eastAsia"/>
-        </w:rPr>
-        <w:t>校验和逐跳可信转发提供了结构基础。换言之，本系统并不是在无结构网络之上额外叠加复杂安全补丁，而是直接在拓扑层级关系上建立消息与控制的基本秩序。</w:t>
+        <w:t>树形模型的另一项优势在于控制权和数据路径都具有明确方向性。节点既可以将请求</w:t>
+      </w:r>
+      <w:proofErr w:type="gramStart"/>
+      <w:r>
+        <w:rPr>
+          <w:rFonts w:hint="eastAsia"/>
+        </w:rPr>
+        <w:t>沿父链</w:t>
+      </w:r>
+      <w:proofErr w:type="gramEnd"/>
+      <w:r>
+        <w:rPr>
+          <w:rFonts w:hint="eastAsia"/>
+        </w:rPr>
+        <w:t>逐级上送，也可以将控制结果</w:t>
+      </w:r>
+      <w:proofErr w:type="gramStart"/>
+      <w:r>
+        <w:rPr>
+          <w:rFonts w:hint="eastAsia"/>
+        </w:rPr>
+        <w:t>沿子链</w:t>
+      </w:r>
+      <w:proofErr w:type="gramEnd"/>
+      <w:r>
+        <w:rPr>
+          <w:rFonts w:hint="eastAsia"/>
+        </w:rPr>
+        <w:t>逐级下发。这种方向性为后续的权限裁决、</w:t>
+      </w:r>
+      <w:proofErr w:type="spellStart"/>
+      <w:r>
+        <w:rPr>
+          <w:rFonts w:hint="eastAsia"/>
+        </w:rPr>
+        <w:t>SourceID</w:t>
+      </w:r>
+      <w:proofErr w:type="spellEnd"/>
+      <w:r>
+        <w:rPr>
+          <w:rFonts w:hint="eastAsia"/>
+        </w:rPr>
+        <w:t xml:space="preserve"> </w:t>
+      </w:r>
+      <w:proofErr w:type="gramStart"/>
+      <w:r>
+        <w:rPr>
+          <w:rFonts w:hint="eastAsia"/>
+        </w:rPr>
+        <w:t>校验和逐跳可信</w:t>
+      </w:r>
+      <w:proofErr w:type="gramEnd"/>
+      <w:r>
+        <w:rPr>
+          <w:rFonts w:hint="eastAsia"/>
+        </w:rPr>
+        <w:t>转发提供了结构基础。换言之，本系统并不是在无结构网络之上额外叠加复杂安全补丁，而是直接在拓扑层级关系上建立消息与控制的基本秩序。</w:t>
       </w:r>
     </w:p>
     <w:p>
@@ -9125,8 +10225,16 @@
         <w:rPr>
           <w:rFonts w:hint="eastAsia"/>
         </w:rPr>
-        <w:t>完成解帧、分发与发送调度。对于个</w:t>
-      </w:r>
+        <w:t>完成解帧、分发与发送调度。对于</w:t>
+      </w:r>
+      <w:proofErr w:type="gramStart"/>
+      <w:r>
+        <w:rPr>
+          <w:rFonts w:hint="eastAsia"/>
+        </w:rPr>
+        <w:t>个</w:t>
+      </w:r>
+      <w:proofErr w:type="gramEnd"/>
       <w:r>
         <w:rPr>
           <w:rFonts w:hint="eastAsia"/>
@@ -9188,32 +10296,44 @@
         <w:rPr>
           <w:rFonts w:hint="eastAsia"/>
         </w:rPr>
-        <w:t xml:space="preserve"> SourceID</w:t>
-      </w:r>
+        <w:t xml:space="preserve"> </w:t>
+      </w:r>
+      <w:proofErr w:type="spellStart"/>
+      <w:r>
+        <w:rPr>
+          <w:rFonts w:hint="eastAsia"/>
+        </w:rPr>
+        <w:t>SourceID</w:t>
+      </w:r>
+      <w:proofErr w:type="spellEnd"/>
       <w:r>
         <w:rPr>
           <w:rFonts w:hint="eastAsia"/>
         </w:rPr>
         <w:t>、</w:t>
       </w:r>
+      <w:proofErr w:type="spellStart"/>
       <w:r>
         <w:rPr>
           <w:rFonts w:hint="eastAsia"/>
         </w:rPr>
         <w:t>TargetID</w:t>
       </w:r>
+      <w:proofErr w:type="spellEnd"/>
       <w:r>
         <w:rPr>
           <w:rFonts w:hint="eastAsia"/>
         </w:rPr>
         <w:t>、</w:t>
       </w:r>
+      <w:proofErr w:type="spellStart"/>
       <w:r>
         <w:rPr>
           <w:rFonts w:hint="eastAsia"/>
         </w:rPr>
         <w:t>SubProto</w:t>
       </w:r>
+      <w:proofErr w:type="spellEnd"/>
       <w:r>
         <w:rPr>
           <w:rFonts w:hint="eastAsia"/>
@@ -9256,17 +10376,39 @@
         </w:rPr>
         <w:t>形式描述控制消息。</w:t>
       </w:r>
-      <w:r>
-        <w:rPr>
-          <w:rFonts w:hint="eastAsia"/>
-        </w:rPr>
-        <w:t xml:space="preserve">SubProto </w:t>
-      </w:r>
-      <w:r>
-        <w:rPr>
-          <w:rFonts w:hint="eastAsia"/>
-        </w:rPr>
-        <w:t>用于标识子协议类型，</w:t>
+      <w:proofErr w:type="spellStart"/>
+      <w:r>
+        <w:rPr>
+          <w:rFonts w:hint="eastAsia"/>
+        </w:rPr>
+        <w:t>SubProto</w:t>
+      </w:r>
+      <w:proofErr w:type="spellEnd"/>
+      <w:r>
+        <w:rPr>
+          <w:rFonts w:hint="eastAsia"/>
+        </w:rPr>
+        <w:t xml:space="preserve"> </w:t>
+      </w:r>
+      <w:r>
+        <w:rPr>
+          <w:rFonts w:hint="eastAsia"/>
+        </w:rPr>
+        <w:t>用于标识</w:t>
+      </w:r>
+      <w:proofErr w:type="gramStart"/>
+      <w:r>
+        <w:rPr>
+          <w:rFonts w:hint="eastAsia"/>
+        </w:rPr>
+        <w:t>子协议</w:t>
+      </w:r>
+      <w:proofErr w:type="gramEnd"/>
+      <w:r>
+        <w:rPr>
+          <w:rFonts w:hint="eastAsia"/>
+        </w:rPr>
+        <w:t>类型，</w:t>
       </w:r>
       <w:r>
         <w:rPr>
@@ -9278,8 +10420,30 @@
         <w:rPr>
           <w:rFonts w:hint="eastAsia"/>
         </w:rPr>
-        <w:t>用于表达该帧在框架层的处理方式，例如是否需要逐跳进入</w:t>
-      </w:r>
+        <w:t>用于表达</w:t>
+      </w:r>
+      <w:proofErr w:type="gramStart"/>
+      <w:r>
+        <w:rPr>
+          <w:rFonts w:hint="eastAsia"/>
+        </w:rPr>
+        <w:t>该帧在</w:t>
+      </w:r>
+      <w:proofErr w:type="gramEnd"/>
+      <w:r>
+        <w:rPr>
+          <w:rFonts w:hint="eastAsia"/>
+        </w:rPr>
+        <w:t>框架层的处理方式，例如是否</w:t>
+      </w:r>
+      <w:proofErr w:type="gramStart"/>
+      <w:r>
+        <w:rPr>
+          <w:rFonts w:hint="eastAsia"/>
+        </w:rPr>
+        <w:t>需要逐跳进入</w:t>
+      </w:r>
+      <w:proofErr w:type="gramEnd"/>
       <w:r>
         <w:rPr>
           <w:rFonts w:hint="eastAsia"/>
@@ -9298,17 +10462,33 @@
         </w:rPr>
         <w:t xml:space="preserve"> Core </w:t>
       </w:r>
+      <w:proofErr w:type="gramStart"/>
       <w:r>
         <w:rPr>
           <w:rFonts w:hint="eastAsia"/>
         </w:rPr>
         <w:t>层依据</w:t>
       </w:r>
-      <w:r>
-        <w:rPr>
-          <w:rFonts w:hint="eastAsia"/>
-        </w:rPr>
-        <w:t xml:space="preserve"> TargetID </w:t>
+      <w:proofErr w:type="gramEnd"/>
+      <w:r>
+        <w:rPr>
+          <w:rFonts w:hint="eastAsia"/>
+        </w:rPr>
+        <w:t xml:space="preserve"> </w:t>
+      </w:r>
+      <w:proofErr w:type="spellStart"/>
+      <w:r>
+        <w:rPr>
+          <w:rFonts w:hint="eastAsia"/>
+        </w:rPr>
+        <w:t>TargetID</w:t>
+      </w:r>
+      <w:proofErr w:type="spellEnd"/>
+      <w:r>
+        <w:rPr>
+          <w:rFonts w:hint="eastAsia"/>
+        </w:rPr>
+        <w:t xml:space="preserve"> </w:t>
       </w:r>
       <w:r>
         <w:rPr>
@@ -9325,7 +10505,35 @@
         <w:rPr>
           <w:rFonts w:hint="eastAsia"/>
         </w:rPr>
-        <w:t>这一设计的意义在于，尽管上层能力分散在不同子协议中，底层消息调度方式仍然保持一致。以</w:t>
+        <w:t>这一设计的意义在于，尽管</w:t>
+      </w:r>
+      <w:proofErr w:type="gramStart"/>
+      <w:r>
+        <w:rPr>
+          <w:rFonts w:hint="eastAsia"/>
+        </w:rPr>
+        <w:t>上层能力</w:t>
+      </w:r>
+      <w:proofErr w:type="gramEnd"/>
+      <w:r>
+        <w:rPr>
+          <w:rFonts w:hint="eastAsia"/>
+        </w:rPr>
+        <w:t>分散在不同</w:t>
+      </w:r>
+      <w:proofErr w:type="gramStart"/>
+      <w:r>
+        <w:rPr>
+          <w:rFonts w:hint="eastAsia"/>
+        </w:rPr>
+        <w:t>子协议</w:t>
+      </w:r>
+      <w:proofErr w:type="gramEnd"/>
+      <w:r>
+        <w:rPr>
+          <w:rFonts w:hint="eastAsia"/>
+        </w:rPr>
+        <w:t>中，底层消息调度方式仍然保持一致。以</w:t>
       </w:r>
       <w:r>
         <w:rPr>
@@ -9343,7 +10551,21 @@
         <w:rPr>
           <w:rFonts w:hint="eastAsia"/>
         </w:rPr>
-        <w:t xml:space="preserve"> SourceID </w:t>
+        <w:t xml:space="preserve"> </w:t>
+      </w:r>
+      <w:proofErr w:type="spellStart"/>
+      <w:r>
+        <w:rPr>
+          <w:rFonts w:hint="eastAsia"/>
+        </w:rPr>
+        <w:t>SourceID</w:t>
+      </w:r>
+      <w:proofErr w:type="spellEnd"/>
+      <w:r>
+        <w:rPr>
+          <w:rFonts w:hint="eastAsia"/>
+        </w:rPr>
+        <w:t xml:space="preserve"> </w:t>
       </w:r>
       <w:r>
         <w:rPr>
@@ -9361,8 +10583,16 @@
         <w:rPr>
           <w:rFonts w:hint="eastAsia"/>
         </w:rPr>
-        <w:t>时仅允许子协议</w:t>
-      </w:r>
+        <w:t>时仅允许</w:t>
+      </w:r>
+      <w:proofErr w:type="gramStart"/>
+      <w:r>
+        <w:rPr>
+          <w:rFonts w:hint="eastAsia"/>
+        </w:rPr>
+        <w:t>子协议</w:t>
+      </w:r>
+      <w:proofErr w:type="gramEnd"/>
       <w:r>
         <w:rPr>
           <w:rFonts w:hint="eastAsia"/>
@@ -9373,7 +10603,21 @@
         <w:rPr>
           <w:rFonts w:hint="eastAsia"/>
         </w:rPr>
-        <w:t>通过，其余子协议消息会被直接丢弃；以</w:t>
+        <w:t>通过，其余</w:t>
+      </w:r>
+      <w:proofErr w:type="gramStart"/>
+      <w:r>
+        <w:rPr>
+          <w:rFonts w:hint="eastAsia"/>
+        </w:rPr>
+        <w:t>子协议</w:t>
+      </w:r>
+      <w:proofErr w:type="gramEnd"/>
+      <w:r>
+        <w:rPr>
+          <w:rFonts w:hint="eastAsia"/>
+        </w:rPr>
+        <w:t>消息会被直接丢弃；以</w:t>
       </w:r>
       <w:r>
         <w:rPr>
@@ -9387,36 +10631,88 @@
         </w:rPr>
         <w:t>、</w:t>
       </w:r>
-      <w:r>
-        <w:rPr>
-          <w:rFonts w:hint="eastAsia"/>
-        </w:rPr>
-        <w:t xml:space="preserve">exec.call </w:t>
-      </w:r>
-      <w:r>
-        <w:rPr>
-          <w:rFonts w:hint="eastAsia"/>
-        </w:rPr>
-        <w:t>为例，请求帧通常采用</w:t>
-      </w:r>
-      <w:r>
-        <w:rPr>
-          <w:rFonts w:hint="eastAsia"/>
-        </w:rPr>
-        <w:t xml:space="preserve"> MajorCmd</w:t>
-      </w:r>
-      <w:r>
-        <w:rPr>
-          <w:rFonts w:hint="eastAsia"/>
-        </w:rPr>
-        <w:t>，以确保中间节点能够参与裁决；而大量响应帧采用</w:t>
-      </w:r>
-      <w:r>
-        <w:rPr>
-          <w:rFonts w:hint="eastAsia"/>
-        </w:rPr>
-        <w:t xml:space="preserve"> MajorOKResp</w:t>
-      </w:r>
+      <w:proofErr w:type="spellStart"/>
+      <w:r>
+        <w:rPr>
+          <w:rFonts w:hint="eastAsia"/>
+        </w:rPr>
+        <w:t>exec.call</w:t>
+      </w:r>
+      <w:proofErr w:type="spellEnd"/>
+      <w:r>
+        <w:rPr>
+          <w:rFonts w:hint="eastAsia"/>
+        </w:rPr>
+        <w:t xml:space="preserve"> </w:t>
+      </w:r>
+      <w:r>
+        <w:rPr>
+          <w:rFonts w:hint="eastAsia"/>
+        </w:rPr>
+        <w:t>为例，请求</w:t>
+      </w:r>
+      <w:proofErr w:type="gramStart"/>
+      <w:r>
+        <w:rPr>
+          <w:rFonts w:hint="eastAsia"/>
+        </w:rPr>
+        <w:t>帧</w:t>
+      </w:r>
+      <w:proofErr w:type="gramEnd"/>
+      <w:r>
+        <w:rPr>
+          <w:rFonts w:hint="eastAsia"/>
+        </w:rPr>
+        <w:t>通常采用</w:t>
+      </w:r>
+      <w:r>
+        <w:rPr>
+          <w:rFonts w:hint="eastAsia"/>
+        </w:rPr>
+        <w:t xml:space="preserve"> </w:t>
+      </w:r>
+      <w:proofErr w:type="spellStart"/>
+      <w:r>
+        <w:rPr>
+          <w:rFonts w:hint="eastAsia"/>
+        </w:rPr>
+        <w:t>MajorCmd</w:t>
+      </w:r>
+      <w:proofErr w:type="spellEnd"/>
+      <w:r>
+        <w:rPr>
+          <w:rFonts w:hint="eastAsia"/>
+        </w:rPr>
+        <w:t>，以确保中间节点能够参与裁决；而大量响应</w:t>
+      </w:r>
+      <w:proofErr w:type="gramStart"/>
+      <w:r>
+        <w:rPr>
+          <w:rFonts w:hint="eastAsia"/>
+        </w:rPr>
+        <w:t>帧</w:t>
+      </w:r>
+      <w:proofErr w:type="gramEnd"/>
+      <w:r>
+        <w:rPr>
+          <w:rFonts w:hint="eastAsia"/>
+        </w:rPr>
+        <w:t>采用</w:t>
+      </w:r>
+      <w:r>
+        <w:rPr>
+          <w:rFonts w:hint="eastAsia"/>
+        </w:rPr>
+        <w:t xml:space="preserve"> </w:t>
+      </w:r>
+      <w:proofErr w:type="spellStart"/>
+      <w:r>
+        <w:rPr>
+          <w:rFonts w:hint="eastAsia"/>
+        </w:rPr>
+        <w:t>MajorOKResp</w:t>
+      </w:r>
+      <w:proofErr w:type="spellEnd"/>
       <w:r>
         <w:rPr>
           <w:rFonts w:hint="eastAsia"/>
@@ -9448,7 +10744,817 @@
     </w:p>
     <w:p>
       <w:pPr>
+        <w:pStyle w:val="2"/>
+      </w:pPr>
+      <w:r>
+        <w:rPr>
+          <w:rFonts w:hint="eastAsia"/>
+        </w:rPr>
+        <w:t>3.</w:t>
+      </w:r>
+      <w:r>
+        <w:rPr>
+          <w:rFonts w:hint="eastAsia"/>
+        </w:rPr>
+        <w:t>3</w:t>
+      </w:r>
+      <w:r>
+        <w:rPr>
+          <w:rFonts w:hint="eastAsia"/>
+        </w:rPr>
+        <w:t xml:space="preserve"> </w:t>
+      </w:r>
+      <w:r>
+        <w:rPr>
+          <w:rFonts w:hint="eastAsia"/>
+        </w:rPr>
+        <w:t>收发处理链路与并发模型</w:t>
+      </w:r>
+    </w:p>
+    <w:p>
+      <w:pPr>
         <w:pStyle w:val="affa"/>
+        <w:rPr>
+          <w:rFonts w:hint="eastAsia"/>
+        </w:rPr>
+      </w:pPr>
+      <w:r>
+        <w:rPr>
+          <w:rFonts w:hint="eastAsia"/>
+        </w:rPr>
+        <w:t>本系统的接收链路可概括为“监听接入</w:t>
+      </w:r>
+      <w:r>
+        <w:rPr>
+          <w:rFonts w:hint="eastAsia"/>
+        </w:rPr>
+        <w:t>-</w:t>
+      </w:r>
+      <w:r>
+        <w:rPr>
+          <w:rFonts w:hint="eastAsia"/>
+        </w:rPr>
+        <w:t xml:space="preserve">Reader </w:t>
+      </w:r>
+      <w:r>
+        <w:rPr>
+          <w:rFonts w:hint="eastAsia"/>
+        </w:rPr>
+        <w:t>解帧</w:t>
+      </w:r>
+      <w:r>
+        <w:rPr>
+          <w:rFonts w:hint="eastAsia"/>
+        </w:rPr>
+        <w:t>-</w:t>
+      </w:r>
+      <w:r>
+        <w:rPr>
+          <w:rFonts w:hint="eastAsia"/>
+        </w:rPr>
+        <w:t xml:space="preserve">Process </w:t>
+      </w:r>
+      <w:r>
+        <w:rPr>
+          <w:rFonts w:hint="eastAsia"/>
+        </w:rPr>
+        <w:t>分发</w:t>
+      </w:r>
+      <w:r>
+        <w:rPr>
+          <w:rFonts w:hint="eastAsia"/>
+        </w:rPr>
+        <w:t>-</w:t>
+      </w:r>
+      <w:proofErr w:type="spellStart"/>
+      <w:r>
+        <w:rPr>
+          <w:rFonts w:hint="eastAsia"/>
+        </w:rPr>
+        <w:t>PreRouting</w:t>
+      </w:r>
+      <w:proofErr w:type="spellEnd"/>
+      <w:r>
+        <w:rPr>
+          <w:rFonts w:hint="eastAsia"/>
+        </w:rPr>
+        <w:t xml:space="preserve">/Dispatcher </w:t>
+      </w:r>
+      <w:r>
+        <w:rPr>
+          <w:rFonts w:hint="eastAsia"/>
+        </w:rPr>
+        <w:t>处理</w:t>
+      </w:r>
+      <w:r>
+        <w:rPr>
+          <w:rFonts w:hint="eastAsia"/>
+        </w:rPr>
+        <w:t>-</w:t>
+      </w:r>
+      <w:r>
+        <w:rPr>
+          <w:rFonts w:hint="eastAsia"/>
+        </w:rPr>
+        <w:t>进入子协议</w:t>
+      </w:r>
+      <w:r>
+        <w:rPr>
+          <w:rFonts w:hint="eastAsia"/>
+        </w:rPr>
+        <w:t xml:space="preserve"> handler</w:t>
+      </w:r>
+      <w:r>
+        <w:rPr>
+          <w:rFonts w:hint="eastAsia"/>
+        </w:rPr>
+        <w:t>”。具体而言，监听器首先接收连接并将其纳入连接管理器；随后</w:t>
+      </w:r>
+      <w:r>
+        <w:rPr>
+          <w:rFonts w:hint="eastAsia"/>
+        </w:rPr>
+        <w:t xml:space="preserve"> Reader </w:t>
+      </w:r>
+      <w:r>
+        <w:rPr>
+          <w:rFonts w:hint="eastAsia"/>
+        </w:rPr>
+        <w:t>从</w:t>
+      </w:r>
+      <w:r>
+        <w:rPr>
+          <w:rFonts w:hint="eastAsia"/>
+        </w:rPr>
+        <w:t xml:space="preserve"> Pipe </w:t>
+      </w:r>
+      <w:r>
+        <w:rPr>
+          <w:rFonts w:hint="eastAsia"/>
+        </w:rPr>
+        <w:t>持续读取字节流，完成</w:t>
+      </w:r>
+      <w:proofErr w:type="gramStart"/>
+      <w:r>
+        <w:rPr>
+          <w:rFonts w:hint="eastAsia"/>
+        </w:rPr>
+        <w:t>解帧后</w:t>
+      </w:r>
+      <w:proofErr w:type="gramEnd"/>
+      <w:r>
+        <w:rPr>
+          <w:rFonts w:hint="eastAsia"/>
+        </w:rPr>
+        <w:t>交由</w:t>
+      </w:r>
+      <w:r>
+        <w:rPr>
+          <w:rFonts w:hint="eastAsia"/>
+        </w:rPr>
+        <w:t xml:space="preserve"> </w:t>
+      </w:r>
+      <w:proofErr w:type="spellStart"/>
+      <w:r>
+        <w:rPr>
+          <w:rFonts w:hint="eastAsia"/>
+        </w:rPr>
+        <w:t>Process.OnReceive</w:t>
+      </w:r>
+      <w:proofErr w:type="spellEnd"/>
+      <w:r>
+        <w:rPr>
+          <w:rFonts w:hint="eastAsia"/>
+        </w:rPr>
+        <w:t>；在常见组合中，</w:t>
+      </w:r>
+      <w:proofErr w:type="spellStart"/>
+      <w:r>
+        <w:rPr>
+          <w:rFonts w:hint="eastAsia"/>
+        </w:rPr>
+        <w:t>PreRoutingProcess</w:t>
+      </w:r>
+      <w:proofErr w:type="spellEnd"/>
+      <w:r>
+        <w:rPr>
+          <w:rFonts w:hint="eastAsia"/>
+        </w:rPr>
+        <w:t xml:space="preserve"> </w:t>
+      </w:r>
+      <w:r>
+        <w:rPr>
+          <w:rFonts w:hint="eastAsia"/>
+        </w:rPr>
+        <w:t>与</w:t>
+      </w:r>
+      <w:r>
+        <w:rPr>
+          <w:rFonts w:hint="eastAsia"/>
+        </w:rPr>
+        <w:t xml:space="preserve"> </w:t>
+      </w:r>
+      <w:proofErr w:type="spellStart"/>
+      <w:r>
+        <w:rPr>
+          <w:rFonts w:hint="eastAsia"/>
+        </w:rPr>
+        <w:t>DispatcherProcess</w:t>
+      </w:r>
+      <w:proofErr w:type="spellEnd"/>
+      <w:r>
+        <w:rPr>
+          <w:rFonts w:hint="eastAsia"/>
+        </w:rPr>
+        <w:t xml:space="preserve"> </w:t>
+      </w:r>
+      <w:r>
+        <w:rPr>
+          <w:rFonts w:hint="eastAsia"/>
+        </w:rPr>
+        <w:t>共同完成后续处理，其中</w:t>
+      </w:r>
+      <w:r>
+        <w:rPr>
+          <w:rFonts w:hint="eastAsia"/>
+        </w:rPr>
+        <w:t xml:space="preserve"> Dispatcher </w:t>
+      </w:r>
+      <w:r>
+        <w:rPr>
+          <w:rFonts w:hint="eastAsia"/>
+        </w:rPr>
+        <w:t>会将消息投递给</w:t>
+      </w:r>
+      <w:r>
+        <w:rPr>
+          <w:rFonts w:hint="eastAsia"/>
+        </w:rPr>
+        <w:t xml:space="preserve"> worker</w:t>
+      </w:r>
+      <w:r>
+        <w:rPr>
+          <w:rFonts w:hint="eastAsia"/>
+        </w:rPr>
+        <w:t>，并按照</w:t>
+      </w:r>
+      <w:r>
+        <w:rPr>
+          <w:rFonts w:hint="eastAsia"/>
+        </w:rPr>
+        <w:t xml:space="preserve"> </w:t>
+      </w:r>
+      <w:proofErr w:type="spellStart"/>
+      <w:r>
+        <w:rPr>
+          <w:rFonts w:hint="eastAsia"/>
+        </w:rPr>
+        <w:t>selectHandler</w:t>
+      </w:r>
+      <w:proofErr w:type="spellEnd"/>
+      <w:r>
+        <w:rPr>
+          <w:rFonts w:hint="eastAsia"/>
+        </w:rPr>
+        <w:t xml:space="preserve"> -&gt; </w:t>
+      </w:r>
+      <w:proofErr w:type="spellStart"/>
+      <w:r>
+        <w:rPr>
+          <w:rFonts w:hint="eastAsia"/>
+        </w:rPr>
+        <w:t>sourceMismatch</w:t>
+      </w:r>
+      <w:proofErr w:type="spellEnd"/>
+      <w:r>
+        <w:rPr>
+          <w:rFonts w:hint="eastAsia"/>
+        </w:rPr>
+        <w:t xml:space="preserve"> -&gt; </w:t>
+      </w:r>
+      <w:proofErr w:type="spellStart"/>
+      <w:r>
+        <w:rPr>
+          <w:rFonts w:hint="eastAsia"/>
+        </w:rPr>
+        <w:t>preRoute</w:t>
+      </w:r>
+      <w:proofErr w:type="spellEnd"/>
+      <w:r>
+        <w:rPr>
+          <w:rFonts w:hint="eastAsia"/>
+        </w:rPr>
+        <w:t xml:space="preserve"> -&gt; </w:t>
+      </w:r>
+      <w:proofErr w:type="spellStart"/>
+      <w:r>
+        <w:rPr>
+          <w:rFonts w:hint="eastAsia"/>
+        </w:rPr>
+        <w:t>handler.OnReceive</w:t>
+      </w:r>
+      <w:proofErr w:type="spellEnd"/>
+      <w:r>
+        <w:rPr>
+          <w:rFonts w:hint="eastAsia"/>
+        </w:rPr>
+        <w:t xml:space="preserve"> </w:t>
+      </w:r>
+      <w:r>
+        <w:rPr>
+          <w:rFonts w:hint="eastAsia"/>
+        </w:rPr>
+        <w:t>的顺序执行。</w:t>
+      </w:r>
+    </w:p>
+    <w:p>
+      <w:pPr>
+        <w:pStyle w:val="affa"/>
+      </w:pPr>
+    </w:p>
+    <w:p>
+      <w:pPr>
+        <w:pStyle w:val="affa"/>
+        <w:rPr>
+          <w:rFonts w:hint="eastAsia"/>
+        </w:rPr>
+      </w:pPr>
+      <w:r>
+        <w:rPr>
+          <w:rFonts w:hint="eastAsia"/>
+        </w:rPr>
+        <w:t>这一处理流程体现了框架层与协议层之间的职责分离。框架层优先处理消息是否需要预路由、是否符合</w:t>
+      </w:r>
+      <w:r>
+        <w:rPr>
+          <w:rFonts w:hint="eastAsia"/>
+        </w:rPr>
+        <w:t xml:space="preserve"> </w:t>
+      </w:r>
+      <w:proofErr w:type="spellStart"/>
+      <w:r>
+        <w:rPr>
+          <w:rFonts w:hint="eastAsia"/>
+        </w:rPr>
+        <w:t>SourceID</w:t>
+      </w:r>
+      <w:proofErr w:type="spellEnd"/>
+      <w:r>
+        <w:rPr>
+          <w:rFonts w:hint="eastAsia"/>
+        </w:rPr>
+        <w:t xml:space="preserve"> </w:t>
+      </w:r>
+      <w:r>
+        <w:rPr>
+          <w:rFonts w:hint="eastAsia"/>
+        </w:rPr>
+        <w:t>一致性规则，再将真正需要业务理解的部分交给相应</w:t>
+      </w:r>
+      <w:proofErr w:type="gramStart"/>
+      <w:r>
+        <w:rPr>
+          <w:rFonts w:hint="eastAsia"/>
+        </w:rPr>
+        <w:t>子协议</w:t>
+      </w:r>
+      <w:proofErr w:type="gramEnd"/>
+      <w:r>
+        <w:rPr>
+          <w:rFonts w:hint="eastAsia"/>
+        </w:rPr>
+        <w:t xml:space="preserve"> handler</w:t>
+      </w:r>
+      <w:r>
+        <w:rPr>
+          <w:rFonts w:hint="eastAsia"/>
+        </w:rPr>
+        <w:t>。</w:t>
+      </w:r>
+      <w:proofErr w:type="gramStart"/>
+      <w:r>
+        <w:rPr>
+          <w:rFonts w:hint="eastAsia"/>
+        </w:rPr>
+        <w:t>如此既</w:t>
+      </w:r>
+      <w:proofErr w:type="gramEnd"/>
+      <w:r>
+        <w:rPr>
+          <w:rFonts w:hint="eastAsia"/>
+        </w:rPr>
+        <w:t>避免了每个子协议重复编写连接校验和路由判断逻辑，也使不同</w:t>
+      </w:r>
+      <w:proofErr w:type="gramStart"/>
+      <w:r>
+        <w:rPr>
+          <w:rFonts w:hint="eastAsia"/>
+        </w:rPr>
+        <w:t>子协议</w:t>
+      </w:r>
+      <w:proofErr w:type="gramEnd"/>
+      <w:r>
+        <w:rPr>
+          <w:rFonts w:hint="eastAsia"/>
+        </w:rPr>
+        <w:t>在安全约束上保持一致。</w:t>
+      </w:r>
+    </w:p>
+    <w:p>
+      <w:pPr>
+        <w:pStyle w:val="affa"/>
+      </w:pPr>
+    </w:p>
+    <w:p>
+      <w:pPr>
+        <w:pStyle w:val="affa"/>
+        <w:rPr>
+          <w:rFonts w:hint="eastAsia"/>
+        </w:rPr>
+      </w:pPr>
+      <w:r>
+        <w:rPr>
+          <w:rFonts w:hint="eastAsia"/>
+        </w:rPr>
+        <w:t>发送链路则遵循“统一入口一补全默认头部</w:t>
+      </w:r>
+      <w:proofErr w:type="gramStart"/>
+      <w:r>
+        <w:rPr>
+          <w:rFonts w:hint="eastAsia"/>
+        </w:rPr>
+        <w:t>一</w:t>
+      </w:r>
+      <w:proofErr w:type="gramEnd"/>
+      <w:r>
+        <w:rPr>
+          <w:rFonts w:hint="eastAsia"/>
+        </w:rPr>
+        <w:t>发送调度</w:t>
+      </w:r>
+      <w:proofErr w:type="gramStart"/>
+      <w:r>
+        <w:rPr>
+          <w:rFonts w:hint="eastAsia"/>
+        </w:rPr>
+        <w:t>一</w:t>
+      </w:r>
+      <w:proofErr w:type="gramEnd"/>
+      <w:r>
+        <w:rPr>
+          <w:rFonts w:hint="eastAsia"/>
+        </w:rPr>
+        <w:t>连接串行写入”的</w:t>
+      </w:r>
+      <w:r>
+        <w:rPr>
+          <w:rFonts w:hint="eastAsia"/>
+        </w:rPr>
+        <w:lastRenderedPageBreak/>
+        <w:t>思路。系统调用</w:t>
+      </w:r>
+      <w:r>
+        <w:rPr>
+          <w:rFonts w:hint="eastAsia"/>
+        </w:rPr>
+        <w:t xml:space="preserve"> </w:t>
+      </w:r>
+      <w:proofErr w:type="spellStart"/>
+      <w:r>
+        <w:rPr>
+          <w:rFonts w:hint="eastAsia"/>
+        </w:rPr>
+        <w:t>server.Send</w:t>
+      </w:r>
+      <w:proofErr w:type="spellEnd"/>
+      <w:r>
+        <w:rPr>
+          <w:rFonts w:hint="eastAsia"/>
+        </w:rPr>
+        <w:t xml:space="preserve">() </w:t>
+      </w:r>
+      <w:r>
+        <w:rPr>
+          <w:rFonts w:hint="eastAsia"/>
+        </w:rPr>
+        <w:t>时，若</w:t>
+      </w:r>
+      <w:r>
+        <w:rPr>
+          <w:rFonts w:hint="eastAsia"/>
+        </w:rPr>
+        <w:t xml:space="preserve"> </w:t>
+      </w:r>
+      <w:proofErr w:type="spellStart"/>
+      <w:r>
+        <w:rPr>
+          <w:rFonts w:hint="eastAsia"/>
+        </w:rPr>
+        <w:t>hop_limit</w:t>
+      </w:r>
+      <w:proofErr w:type="spellEnd"/>
+      <w:r>
+        <w:rPr>
+          <w:rFonts w:hint="eastAsia"/>
+        </w:rPr>
+        <w:t xml:space="preserve"> </w:t>
+      </w:r>
+      <w:r>
+        <w:rPr>
+          <w:rFonts w:hint="eastAsia"/>
+        </w:rPr>
+        <w:t>或</w:t>
+      </w:r>
+      <w:r>
+        <w:rPr>
+          <w:rFonts w:hint="eastAsia"/>
+        </w:rPr>
+        <w:t xml:space="preserve"> </w:t>
+      </w:r>
+      <w:proofErr w:type="spellStart"/>
+      <w:r>
+        <w:rPr>
+          <w:rFonts w:hint="eastAsia"/>
+        </w:rPr>
+        <w:t>trace_id</w:t>
+      </w:r>
+      <w:proofErr w:type="spellEnd"/>
+      <w:r>
+        <w:rPr>
+          <w:rFonts w:hint="eastAsia"/>
+        </w:rPr>
+        <w:t xml:space="preserve"> </w:t>
+      </w:r>
+      <w:r>
+        <w:rPr>
+          <w:rFonts w:hint="eastAsia"/>
+        </w:rPr>
+        <w:t>等字段未设置，会先补齐默认值；随后消息交由</w:t>
+      </w:r>
+      <w:r>
+        <w:rPr>
+          <w:rFonts w:hint="eastAsia"/>
+        </w:rPr>
+        <w:t xml:space="preserve"> SendDispatcher </w:t>
+      </w:r>
+      <w:r>
+        <w:rPr>
+          <w:rFonts w:hint="eastAsia"/>
+        </w:rPr>
+        <w:t>入队，再由分片</w:t>
+      </w:r>
+      <w:r>
+        <w:rPr>
+          <w:rFonts w:hint="eastAsia"/>
+        </w:rPr>
+        <w:t xml:space="preserve"> worker </w:t>
+      </w:r>
+      <w:r>
+        <w:rPr>
+          <w:rFonts w:hint="eastAsia"/>
+        </w:rPr>
+        <w:t>和连接级</w:t>
+      </w:r>
+      <w:r>
+        <w:rPr>
+          <w:rFonts w:hint="eastAsia"/>
+        </w:rPr>
+        <w:t xml:space="preserve"> writer </w:t>
+      </w:r>
+      <w:r>
+        <w:rPr>
+          <w:rFonts w:hint="eastAsia"/>
+        </w:rPr>
+        <w:t>完成发送。单连接串行写入能够避免多个</w:t>
+      </w:r>
+      <w:r>
+        <w:rPr>
+          <w:rFonts w:hint="eastAsia"/>
+        </w:rPr>
+        <w:t xml:space="preserve"> goroutine </w:t>
+      </w:r>
+      <w:r>
+        <w:rPr>
+          <w:rFonts w:hint="eastAsia"/>
+        </w:rPr>
+        <w:t>同时向同一连接</w:t>
+      </w:r>
+      <w:proofErr w:type="gramStart"/>
+      <w:r>
+        <w:rPr>
+          <w:rFonts w:hint="eastAsia"/>
+        </w:rPr>
+        <w:t>直接写帧而</w:t>
+      </w:r>
+      <w:proofErr w:type="gramEnd"/>
+      <w:r>
+        <w:rPr>
+          <w:rFonts w:hint="eastAsia"/>
+        </w:rPr>
+        <w:t>造成竞争和乱序，这对多跳树形网络中的稳定转发尤为关键。</w:t>
+      </w:r>
+    </w:p>
+    <w:p>
+      <w:pPr>
+        <w:pStyle w:val="affa"/>
+      </w:pPr>
+    </w:p>
+    <w:p>
+      <w:pPr>
+        <w:pStyle w:val="affa"/>
+      </w:pPr>
+      <w:r>
+        <w:rPr>
+          <w:rFonts w:hint="eastAsia"/>
+        </w:rPr>
+        <w:t>从并发模型看，系统并未将“高并发”简单理解为所有消息的无序并发处理，而是在可并行的环节并行，在必须保持连接顺序的环节串行。例如，不同连接上的消息可以由不同</w:t>
+      </w:r>
+      <w:r>
+        <w:rPr>
+          <w:rFonts w:hint="eastAsia"/>
+        </w:rPr>
+        <w:t xml:space="preserve"> worker </w:t>
+      </w:r>
+      <w:r>
+        <w:rPr>
+          <w:rFonts w:hint="eastAsia"/>
+        </w:rPr>
+        <w:t>并行处理，但同一连接上的</w:t>
+      </w:r>
+      <w:proofErr w:type="gramStart"/>
+      <w:r>
+        <w:rPr>
+          <w:rFonts w:hint="eastAsia"/>
+        </w:rPr>
+        <w:t>写入仍</w:t>
+      </w:r>
+      <w:proofErr w:type="gramEnd"/>
+      <w:r>
+        <w:rPr>
+          <w:rFonts w:hint="eastAsia"/>
+        </w:rPr>
+        <w:t>通过</w:t>
+      </w:r>
+      <w:r>
+        <w:rPr>
+          <w:rFonts w:hint="eastAsia"/>
+        </w:rPr>
+        <w:t xml:space="preserve"> writer </w:t>
+      </w:r>
+      <w:r>
+        <w:rPr>
+          <w:rFonts w:hint="eastAsia"/>
+        </w:rPr>
+        <w:t>保持顺序一致。这样的设计更符合消息中枢系统对可靠性和</w:t>
+      </w:r>
+      <w:proofErr w:type="gramStart"/>
+      <w:r>
+        <w:rPr>
+          <w:rFonts w:hint="eastAsia"/>
+        </w:rPr>
+        <w:t>可</w:t>
+      </w:r>
+      <w:proofErr w:type="gramEnd"/>
+      <w:r>
+        <w:rPr>
+          <w:rFonts w:hint="eastAsia"/>
+        </w:rPr>
+        <w:t>追踪性的要求。</w:t>
+      </w:r>
+    </w:p>
+    <w:p>
+      <w:pPr>
+        <w:pStyle w:val="affa"/>
+        <w:rPr>
+          <w:rFonts w:hint="eastAsia"/>
+        </w:rPr>
+      </w:pPr>
+    </w:p>
+    <w:p>
+      <w:pPr>
+        <w:pStyle w:val="2"/>
+      </w:pPr>
+      <w:r>
+        <w:rPr>
+          <w:rFonts w:hint="eastAsia"/>
+        </w:rPr>
+        <w:t xml:space="preserve">3.2 </w:t>
+      </w:r>
+      <w:r>
+        <w:rPr>
+          <w:rFonts w:hint="eastAsia"/>
+        </w:rPr>
+        <w:t>收发处理链路与并发模型</w:t>
+      </w:r>
+    </w:p>
+    <w:p>
+      <w:pPr>
+        <w:pStyle w:val="affa"/>
+      </w:pPr>
+      <w:r>
+        <w:rPr>
+          <w:rFonts w:hint="eastAsia"/>
+        </w:rPr>
+        <w:t>在传输抽象上，本系统已不再将物理连接视为连接对象，而是统一采用</w:t>
+      </w:r>
+      <w:r>
+        <w:rPr>
+          <w:rFonts w:hint="eastAsia"/>
+        </w:rPr>
+        <w:t xml:space="preserve"> Pipe </w:t>
+      </w:r>
+      <w:r>
+        <w:rPr>
+          <w:rFonts w:hint="eastAsia"/>
+        </w:rPr>
+        <w:t>模型承载底层字节流。这意味着，无论底层承载是</w:t>
+      </w:r>
+      <w:r>
+        <w:rPr>
+          <w:rFonts w:hint="eastAsia"/>
+        </w:rPr>
+        <w:t xml:space="preserve"> TCP </w:t>
+      </w:r>
+      <w:r>
+        <w:rPr>
+          <w:rFonts w:hint="eastAsia"/>
+        </w:rPr>
+        <w:t>还是其他可读写字节流，框架层都能够通过统</w:t>
+      </w:r>
+    </w:p>
+    <w:p>
+      <w:pPr>
+        <w:pStyle w:val="affa"/>
+      </w:pPr>
+    </w:p>
+    <w:p>
+      <w:pPr>
+        <w:pStyle w:val="affa"/>
+      </w:pPr>
+    </w:p>
+    <w:p>
+      <w:pPr>
+        <w:pStyle w:val="2"/>
+      </w:pPr>
+      <w:r>
+        <w:rPr>
+          <w:rFonts w:hint="eastAsia"/>
+        </w:rPr>
+        <w:t xml:space="preserve">3.2 </w:t>
+      </w:r>
+      <w:r>
+        <w:rPr>
+          <w:rFonts w:hint="eastAsia"/>
+        </w:rPr>
+        <w:t>收发处理链路与并发模型</w:t>
+      </w:r>
+    </w:p>
+    <w:p>
+      <w:pPr>
+        <w:pStyle w:val="affa"/>
+      </w:pPr>
+      <w:r>
+        <w:rPr>
+          <w:rFonts w:hint="eastAsia"/>
+        </w:rPr>
+        <w:t>在传输抽象上，本系统已不再将物理连接视为连接对象，而是统一采用</w:t>
+      </w:r>
+      <w:r>
+        <w:rPr>
+          <w:rFonts w:hint="eastAsia"/>
+        </w:rPr>
+        <w:t xml:space="preserve"> Pipe </w:t>
+      </w:r>
+      <w:r>
+        <w:rPr>
+          <w:rFonts w:hint="eastAsia"/>
+        </w:rPr>
+        <w:t>模型承载底层字节流。这意味着，无论底层承载是</w:t>
+      </w:r>
+      <w:r>
+        <w:rPr>
+          <w:rFonts w:hint="eastAsia"/>
+        </w:rPr>
+        <w:t xml:space="preserve"> TCP </w:t>
+      </w:r>
+      <w:r>
+        <w:rPr>
+          <w:rFonts w:hint="eastAsia"/>
+        </w:rPr>
+        <w:t>还是其他可读写字节流，框架层都能够通过统</w:t>
+      </w:r>
+    </w:p>
+    <w:p>
+      <w:pPr>
+        <w:pStyle w:val="affa"/>
+      </w:pPr>
+    </w:p>
+    <w:p>
+      <w:pPr>
+        <w:pStyle w:val="affa"/>
+        <w:rPr>
+          <w:rFonts w:hint="eastAsia"/>
+        </w:rPr>
       </w:pPr>
     </w:p>
     <w:p>
@@ -11187,7 +13293,7 @@
           <v:shape id="_x0000_i1028" type="#_x0000_t75" style="width:182.1pt;height:63.15pt" o:ole="">
             <v:imagedata r:id="rId28" o:title=""/>
           </v:shape>
-          <o:OLEObject Type="Embed" ProgID="Equation.DSMT4" ShapeID="_x0000_i1028" DrawAspect="Content" ObjectID="_1836940328" r:id="rId29"/>
+          <o:OLEObject Type="Embed" ProgID="Equation.DSMT4" ShapeID="_x0000_i1028" DrawAspect="Content" ObjectID="_1837007336" r:id="rId29"/>
         </w:object>
       </w:r>
       <w:r>
@@ -13079,7 +15185,7 @@
           <v:shape id="_x0000_i1029" type="#_x0000_t75" style="width:182.1pt;height:63.15pt" o:ole="">
             <v:imagedata r:id="rId28" o:title=""/>
           </v:shape>
-          <o:OLEObject Type="Embed" ProgID="Equation.DSMT4" ShapeID="_x0000_i1029" DrawAspect="Content" ObjectID="_1836940329" r:id="rId30"/>
+          <o:OLEObject Type="Embed" ProgID="Equation.DSMT4" ShapeID="_x0000_i1029" DrawAspect="Content" ObjectID="_1837007337" r:id="rId30"/>
         </w:object>
       </w:r>
       <w:r>
@@ -14967,7 +17073,7 @@
           <v:shape id="_x0000_i1030" type="#_x0000_t75" style="width:182.1pt;height:63.15pt" o:ole="">
             <v:imagedata r:id="rId28" o:title=""/>
           </v:shape>
-          <o:OLEObject Type="Embed" ProgID="Equation.DSMT4" ShapeID="_x0000_i1030" DrawAspect="Content" ObjectID="_1836940330" r:id="rId31"/>
+          <o:OLEObject Type="Embed" ProgID="Equation.DSMT4" ShapeID="_x0000_i1030" DrawAspect="Content" ObjectID="_1837007338" r:id="rId31"/>
         </w:object>
       </w:r>
       <w:r>
@@ -17839,8 +19945,16 @@
         <w:rPr>
           <w:rFonts w:hint="eastAsia"/>
         </w:rPr>
-        <w:t>孙品一</w:t>
-      </w:r>
+        <w:t>孙品</w:t>
+      </w:r>
+      <w:proofErr w:type="gramStart"/>
+      <w:r>
+        <w:rPr>
+          <w:rFonts w:hint="eastAsia"/>
+        </w:rPr>
+        <w:t>一</w:t>
+      </w:r>
+      <w:proofErr w:type="gramEnd"/>
       <w:r>
         <w:rPr>
           <w:rFonts w:hint="eastAsia"/>
@@ -19228,7 +21342,15 @@
         <w:pStyle w:val="affa"/>
       </w:pPr>
       <w:r>
-        <w:t>以纸张为载体的文献在引做参考文献时不必注明其载体类型。</w:t>
+        <w:t>以纸张为载体的文献</w:t>
+      </w:r>
+      <w:proofErr w:type="gramStart"/>
+      <w:r>
+        <w:t>在引做参考</w:t>
+      </w:r>
+      <w:proofErr w:type="gramEnd"/>
+      <w:r>
+        <w:t>文献时不必注明其载体类型。</w:t>
       </w:r>
     </w:p>
     <w:p>
@@ -19459,7 +21581,29 @@
                                 <w:sz w:val="21"/>
                                 <w:szCs w:val="21"/>
                               </w:rPr>
-                              <w:t>参考文献格式以模板为准，知网等网站提供的格式与模板要求不一致，请自行修改！</w:t>
+                              <w:t>参考文献格式以模板为准，</w:t>
+                            </w:r>
+                            <w:proofErr w:type="gramStart"/>
+                            <w:r>
+                              <w:rPr>
+                                <w:rFonts w:hint="eastAsia"/>
+                                <w:b/>
+                                <w:color w:val="FF0000"/>
+                                <w:sz w:val="21"/>
+                                <w:szCs w:val="21"/>
+                              </w:rPr>
+                              <w:t>知网等</w:t>
+                            </w:r>
+                            <w:proofErr w:type="gramEnd"/>
+                            <w:r>
+                              <w:rPr>
+                                <w:rFonts w:hint="eastAsia"/>
+                                <w:b/>
+                                <w:color w:val="FF0000"/>
+                                <w:sz w:val="21"/>
+                                <w:szCs w:val="21"/>
+                              </w:rPr>
+                              <w:t>网站提供的格式与模板要求不一致，请自行修改！</w:t>
                             </w:r>
                           </w:p>
                           <w:p>
@@ -19480,7 +21624,31 @@
                                 <w:szCs w:val="21"/>
                                 <w:highlight w:val="yellow"/>
                               </w:rPr>
-                              <w:t>下述例程为知网下载例程，页码之后的</w:t>
+                              <w:t>下述例程</w:t>
+                            </w:r>
+                            <w:proofErr w:type="gramStart"/>
+                            <w:r>
+                              <w:rPr>
+                                <w:rFonts w:hint="eastAsia"/>
+                                <w:b/>
+                                <w:color w:val="FF0000"/>
+                                <w:sz w:val="21"/>
+                                <w:szCs w:val="21"/>
+                                <w:highlight w:val="yellow"/>
+                              </w:rPr>
+                              <w:t>为知网下载</w:t>
+                            </w:r>
+                            <w:proofErr w:type="gramEnd"/>
+                            <w:r>
+                              <w:rPr>
+                                <w:rFonts w:hint="eastAsia"/>
+                                <w:b/>
+                                <w:color w:val="FF0000"/>
+                                <w:sz w:val="21"/>
+                                <w:szCs w:val="21"/>
+                                <w:highlight w:val="yellow"/>
+                              </w:rPr>
+                              <w:t>例程，页码之后的</w:t>
                             </w:r>
                             <w:r>
                               <w:rPr>
@@ -19534,6 +21702,7 @@
                               </w:rPr>
                               <w:t xml:space="preserve">1] </w:t>
                             </w:r>
+                            <w:proofErr w:type="gramStart"/>
                             <w:r>
                               <w:rPr>
                                 <w:rFonts w:hint="eastAsia"/>
@@ -19544,6 +21713,7 @@
                               </w:rPr>
                               <w:t>李琳杰</w:t>
                             </w:r>
+                            <w:proofErr w:type="gramEnd"/>
                             <w:r>
                               <w:rPr>
                                 <w:rFonts w:hint="eastAsia"/>
@@ -19654,6 +21824,7 @@
                               </w:rPr>
                               <w:t xml:space="preserve">, 2024, (05): 9-12. </w:t>
                             </w:r>
+                            <w:proofErr w:type="gramStart"/>
                             <w:r>
                               <w:rPr>
                                 <w:rFonts w:hint="eastAsia"/>
@@ -19663,7 +21834,19 @@
                                 <w:sz w:val="21"/>
                                 <w:szCs w:val="21"/>
                               </w:rPr>
-                              <w:t>DOI:10.19950/j.cnki.CN61-1121/TH.2024.05.002.</w:t>
+                              <w:t>DOI:10.19950/j.cnki.CN</w:t>
+                            </w:r>
+                            <w:proofErr w:type="gramEnd"/>
+                            <w:r>
+                              <w:rPr>
+                                <w:rFonts w:hint="eastAsia"/>
+                                <w:b/>
+                                <w:strike/>
+                                <w:color w:val="FF0000"/>
+                                <w:sz w:val="21"/>
+                                <w:szCs w:val="21"/>
+                              </w:rPr>
+                              <w:t>61-1121/TH.2024.05.002.</w:t>
                             </w:r>
                           </w:p>
                         </w:txbxContent>
@@ -19697,7 +21880,29 @@
                           <w:sz w:val="21"/>
                           <w:szCs w:val="21"/>
                         </w:rPr>
-                        <w:t>参考文献格式以模板为准，知网等网站提供的格式与模板要求不一致，请自行修改！</w:t>
+                        <w:t>参考文献格式以模板为准，</w:t>
+                      </w:r>
+                      <w:proofErr w:type="gramStart"/>
+                      <w:r>
+                        <w:rPr>
+                          <w:rFonts w:hint="eastAsia"/>
+                          <w:b/>
+                          <w:color w:val="FF0000"/>
+                          <w:sz w:val="21"/>
+                          <w:szCs w:val="21"/>
+                        </w:rPr>
+                        <w:t>知网等</w:t>
+                      </w:r>
+                      <w:proofErr w:type="gramEnd"/>
+                      <w:r>
+                        <w:rPr>
+                          <w:rFonts w:hint="eastAsia"/>
+                          <w:b/>
+                          <w:color w:val="FF0000"/>
+                          <w:sz w:val="21"/>
+                          <w:szCs w:val="21"/>
+                        </w:rPr>
+                        <w:t>网站提供的格式与模板要求不一致，请自行修改！</w:t>
                       </w:r>
                     </w:p>
                     <w:p>
@@ -19718,7 +21923,31 @@
                           <w:szCs w:val="21"/>
                           <w:highlight w:val="yellow"/>
                         </w:rPr>
-                        <w:t>下述例程为知网下载例程，页码之后的</w:t>
+                        <w:t>下述例程</w:t>
+                      </w:r>
+                      <w:proofErr w:type="gramStart"/>
+                      <w:r>
+                        <w:rPr>
+                          <w:rFonts w:hint="eastAsia"/>
+                          <w:b/>
+                          <w:color w:val="FF0000"/>
+                          <w:sz w:val="21"/>
+                          <w:szCs w:val="21"/>
+                          <w:highlight w:val="yellow"/>
+                        </w:rPr>
+                        <w:t>为知网下载</w:t>
+                      </w:r>
+                      <w:proofErr w:type="gramEnd"/>
+                      <w:r>
+                        <w:rPr>
+                          <w:rFonts w:hint="eastAsia"/>
+                          <w:b/>
+                          <w:color w:val="FF0000"/>
+                          <w:sz w:val="21"/>
+                          <w:szCs w:val="21"/>
+                          <w:highlight w:val="yellow"/>
+                        </w:rPr>
+                        <w:t>例程，页码之后的</w:t>
                       </w:r>
                       <w:r>
                         <w:rPr>
@@ -19772,6 +22001,7 @@
                         </w:rPr>
                         <w:t xml:space="preserve">1] </w:t>
                       </w:r>
+                      <w:proofErr w:type="gramStart"/>
                       <w:r>
                         <w:rPr>
                           <w:rFonts w:hint="eastAsia"/>
@@ -19782,6 +22012,7 @@
                         </w:rPr>
                         <w:t>李琳杰</w:t>
                       </w:r>
+                      <w:proofErr w:type="gramEnd"/>
                       <w:r>
                         <w:rPr>
                           <w:rFonts w:hint="eastAsia"/>
@@ -19892,6 +22123,7 @@
                         </w:rPr>
                         <w:t xml:space="preserve">, 2024, (05): 9-12. </w:t>
                       </w:r>
+                      <w:proofErr w:type="gramStart"/>
                       <w:r>
                         <w:rPr>
                           <w:rFonts w:hint="eastAsia"/>
@@ -19901,7 +22133,19 @@
                           <w:sz w:val="21"/>
                           <w:szCs w:val="21"/>
                         </w:rPr>
-                        <w:t>DOI:10.19950/j.cnki.CN61-1121/TH.2024.05.002.</w:t>
+                        <w:t>DOI:10.19950/j.cnki.CN</w:t>
+                      </w:r>
+                      <w:proofErr w:type="gramEnd"/>
+                      <w:r>
+                        <w:rPr>
+                          <w:rFonts w:hint="eastAsia"/>
+                          <w:b/>
+                          <w:strike/>
+                          <w:color w:val="FF0000"/>
+                          <w:sz w:val="21"/>
+                          <w:szCs w:val="21"/>
+                        </w:rPr>
+                        <w:t>61-1121/TH.2024.05.002.</w:t>
                       </w:r>
                     </w:p>
                   </w:txbxContent>
@@ -20087,8 +22331,25 @@
         </w:rPr>
         <w:t xml:space="preserve">[1] </w:t>
       </w:r>
-      <w:r>
-        <w:t>D.Spinellis, K.Raptis. Component mining: a process and its pattern language[J]. Information and Software Technology,</w:t>
+      <w:proofErr w:type="spellStart"/>
+      <w:proofErr w:type="gramStart"/>
+      <w:r>
+        <w:t>D.Spinellis</w:t>
+      </w:r>
+      <w:proofErr w:type="spellEnd"/>
+      <w:proofErr w:type="gramEnd"/>
+      <w:r>
+        <w:t xml:space="preserve">, </w:t>
+      </w:r>
+      <w:proofErr w:type="spellStart"/>
+      <w:proofErr w:type="gramStart"/>
+      <w:r>
+        <w:t>K.Raptis</w:t>
+      </w:r>
+      <w:proofErr w:type="spellEnd"/>
+      <w:proofErr w:type="gramEnd"/>
+      <w:r>
+        <w:t>. Component mining: a process and its pattern language[J]. Information and Software Technology,</w:t>
       </w:r>
       <w:r>
         <w:rPr>
@@ -20140,9 +22401,11 @@
       <w:r>
         <w:t xml:space="preserve">, </w:t>
       </w:r>
+      <w:proofErr w:type="gramStart"/>
       <w:r>
         <w:t>梅宏</w:t>
       </w:r>
+      <w:proofErr w:type="gramEnd"/>
       <w:r>
         <w:t xml:space="preserve">, </w:t>
       </w:r>
@@ -20292,7 +22555,15 @@
         <w:t xml:space="preserve">[4] </w:t>
       </w:r>
       <w:r>
-        <w:t>Nenad Medvidovic, Richard Taylor</w:t>
+        <w:t xml:space="preserve">Nenad </w:t>
+      </w:r>
+      <w:proofErr w:type="spellStart"/>
+      <w:r>
+        <w:t>Medvidovic</w:t>
+      </w:r>
+      <w:proofErr w:type="spellEnd"/>
+      <w:r>
+        <w:t>, Richard Taylor</w:t>
       </w:r>
       <w:r>
         <w:rPr>
@@ -20360,24 +22631,28 @@
         </w:rPr>
         <w:t xml:space="preserve">[5] </w:t>
       </w:r>
+      <w:proofErr w:type="gramStart"/>
       <w:r>
         <w:rPr>
           <w:highlight w:val="yellow"/>
         </w:rPr>
         <w:t>窦郁宏</w:t>
       </w:r>
+      <w:proofErr w:type="gramEnd"/>
       <w:r>
         <w:rPr>
           <w:highlight w:val="yellow"/>
         </w:rPr>
         <w:t xml:space="preserve">, </w:t>
       </w:r>
+      <w:proofErr w:type="gramStart"/>
       <w:r>
         <w:rPr>
           <w:highlight w:val="yellow"/>
         </w:rPr>
         <w:t>陈松乔</w:t>
       </w:r>
+      <w:proofErr w:type="gramEnd"/>
       <w:r>
         <w:rPr>
           <w:highlight w:val="yellow"/>
@@ -20557,12 +22832,14 @@
         </w:rPr>
         <w:t xml:space="preserve">[7] </w:t>
       </w:r>
+      <w:proofErr w:type="gramStart"/>
       <w:r>
         <w:rPr>
           <w:highlight w:val="yellow"/>
         </w:rPr>
         <w:t>贾名字</w:t>
       </w:r>
+      <w:proofErr w:type="gramEnd"/>
       <w:r>
         <w:rPr>
           <w:highlight w:val="yellow"/>
@@ -21173,8 +23450,16 @@
         <w:rPr>
           <w:rFonts w:hint="eastAsia"/>
         </w:rPr>
-        <w:t>孙品一</w:t>
-      </w:r>
+        <w:t>孙品</w:t>
+      </w:r>
+      <w:proofErr w:type="gramStart"/>
+      <w:r>
+        <w:rPr>
+          <w:rFonts w:hint="eastAsia"/>
+        </w:rPr>
+        <w:t>一</w:t>
+      </w:r>
+      <w:proofErr w:type="gramEnd"/>
       <w:r>
         <w:rPr>
           <w:rFonts w:hint="eastAsia"/>
@@ -21707,15 +23992,19 @@
         </w:rPr>
         <w:t xml:space="preserve">[18] </w:t>
       </w:r>
+      <w:proofErr w:type="gramStart"/>
       <w:r>
         <w:t>任洪敏</w:t>
       </w:r>
+      <w:proofErr w:type="gramEnd"/>
       <w:r>
         <w:t xml:space="preserve">, </w:t>
       </w:r>
+      <w:proofErr w:type="gramStart"/>
       <w:r>
         <w:t>钱乐秋</w:t>
       </w:r>
+      <w:proofErr w:type="gramEnd"/>
       <w:r>
         <w:t xml:space="preserve">. </w:t>
       </w:r>
@@ -22015,13 +24304,29 @@
           <w:rFonts w:hint="eastAsia"/>
           <w:highlight w:val="yellow"/>
         </w:rPr>
-        <w:t>）个人著者，其姓全部著录，字母全大写，名可缩写为首字母；如用首字母无法识别该人名时，则用全名。采用姓在前名在后的著录形式。欧美著者的名可用缩写字母，</w:t>
-      </w:r>
+        <w:t>）个人著者，其姓全部著录，字母全大写，名可缩写为首字母；</w:t>
+      </w:r>
+      <w:proofErr w:type="gramStart"/>
       <w:r>
         <w:rPr>
           <w:rFonts w:hint="eastAsia"/>
           <w:highlight w:val="yellow"/>
         </w:rPr>
+        <w:t>如用首字母</w:t>
+      </w:r>
+      <w:proofErr w:type="gramEnd"/>
+      <w:r>
+        <w:rPr>
+          <w:rFonts w:hint="eastAsia"/>
+          <w:highlight w:val="yellow"/>
+        </w:rPr>
+        <w:t>无法识别该人名时，则用全名。采用姓在前名在后的著录形式。欧美著者的名可用缩写字母，</w:t>
+      </w:r>
+      <w:r>
+        <w:rPr>
+          <w:rFonts w:hint="eastAsia"/>
+          <w:highlight w:val="yellow"/>
+        </w:rPr>
         <w:t xml:space="preserve"> </w:t>
       </w:r>
       <w:r>
@@ -22029,7 +24334,23 @@
           <w:rFonts w:hint="eastAsia"/>
           <w:highlight w:val="yellow"/>
         </w:rPr>
-        <w:t>缩写名后省略缩写点。欧美著者的中译名只著录其姓；同姓不同名的欧美著者，其中译名不仅要著录其姓，还需著录其名的首字母。</w:t>
+        <w:t>缩写名后省略缩写点。欧美著者的中译名只著录其姓；同姓</w:t>
+      </w:r>
+      <w:proofErr w:type="gramStart"/>
+      <w:r>
+        <w:rPr>
+          <w:rFonts w:hint="eastAsia"/>
+          <w:highlight w:val="yellow"/>
+        </w:rPr>
+        <w:t>不</w:t>
+      </w:r>
+      <w:proofErr w:type="gramEnd"/>
+      <w:r>
+        <w:rPr>
+          <w:rFonts w:hint="eastAsia"/>
+          <w:highlight w:val="yellow"/>
+        </w:rPr>
+        <w:t>同名的欧美著者，其中译名不仅要著录其姓，还需著录其名的首字母。</w:t>
       </w:r>
     </w:p>
     <w:p>
@@ -22067,8 +24388,25 @@
         </w:rPr>
         <w:t xml:space="preserve">[1] </w:t>
       </w:r>
-      <w:r>
-        <w:t>D.Spinellis, K.Raptis. Component mining: a process and its pattern language[J]. Information and Software Technology,</w:t>
+      <w:proofErr w:type="spellStart"/>
+      <w:proofErr w:type="gramStart"/>
+      <w:r>
+        <w:t>D.Spinellis</w:t>
+      </w:r>
+      <w:proofErr w:type="spellEnd"/>
+      <w:proofErr w:type="gramEnd"/>
+      <w:r>
+        <w:t xml:space="preserve">, </w:t>
+      </w:r>
+      <w:proofErr w:type="spellStart"/>
+      <w:proofErr w:type="gramStart"/>
+      <w:r>
+        <w:t>K.Raptis</w:t>
+      </w:r>
+      <w:proofErr w:type="spellEnd"/>
+      <w:proofErr w:type="gramEnd"/>
+      <w:r>
+        <w:t>. Component mining: a process and its pattern language[J]. Information and Software Technology,</w:t>
       </w:r>
       <w:r>
         <w:rPr>
@@ -22120,9 +24458,11 @@
       <w:r>
         <w:t xml:space="preserve">, </w:t>
       </w:r>
+      <w:proofErr w:type="gramStart"/>
       <w:r>
         <w:t>梅宏</w:t>
       </w:r>
+      <w:proofErr w:type="gramEnd"/>
       <w:r>
         <w:t xml:space="preserve">, </w:t>
       </w:r>
@@ -22272,7 +24612,15 @@
         <w:t xml:space="preserve">[4] </w:t>
       </w:r>
       <w:r>
-        <w:t>Nenad Medvidovic, Richard Taylor</w:t>
+        <w:t xml:space="preserve">Nenad </w:t>
+      </w:r>
+      <w:proofErr w:type="spellStart"/>
+      <w:r>
+        <w:t>Medvidovic</w:t>
+      </w:r>
+      <w:proofErr w:type="spellEnd"/>
+      <w:r>
+        <w:t>, Richard Taylor</w:t>
       </w:r>
       <w:r>
         <w:rPr>
@@ -22333,15 +24681,19 @@
       <w:r>
         <w:t xml:space="preserve">[5] </w:t>
       </w:r>
+      <w:proofErr w:type="gramStart"/>
       <w:r>
         <w:t>窦郁宏</w:t>
       </w:r>
+      <w:proofErr w:type="gramEnd"/>
       <w:r>
         <w:t xml:space="preserve">, </w:t>
       </w:r>
+      <w:proofErr w:type="gramStart"/>
       <w:r>
         <w:t>陈松乔</w:t>
       </w:r>
+      <w:proofErr w:type="gramEnd"/>
       <w:r>
         <w:t xml:space="preserve">. </w:t>
       </w:r>
@@ -22469,9 +24821,11 @@
       <w:r>
         <w:t xml:space="preserve">[7] </w:t>
       </w:r>
+      <w:proofErr w:type="gramStart"/>
       <w:r>
         <w:t>贾名字</w:t>
       </w:r>
+      <w:proofErr w:type="gramEnd"/>
       <w:r>
         <w:t xml:space="preserve">. </w:t>
       </w:r>
@@ -22807,8 +25161,16 @@
         <w:rPr>
           <w:rFonts w:hint="eastAsia"/>
         </w:rPr>
-        <w:t>孙品一</w:t>
-      </w:r>
+        <w:t>孙品</w:t>
+      </w:r>
+      <w:proofErr w:type="gramStart"/>
+      <w:r>
+        <w:rPr>
+          <w:rFonts w:hint="eastAsia"/>
+        </w:rPr>
+        <w:t>一</w:t>
+      </w:r>
+      <w:proofErr w:type="gramEnd"/>
       <w:r>
         <w:rPr>
           <w:rFonts w:hint="eastAsia"/>
@@ -23338,15 +25700,19 @@
         </w:rPr>
         <w:t xml:space="preserve">[18] </w:t>
       </w:r>
+      <w:proofErr w:type="gramStart"/>
       <w:r>
         <w:t>任洪敏</w:t>
       </w:r>
+      <w:proofErr w:type="gramEnd"/>
       <w:r>
         <w:t xml:space="preserve">, </w:t>
       </w:r>
+      <w:proofErr w:type="gramStart"/>
       <w:r>
         <w:t>钱乐秋</w:t>
       </w:r>
+      <w:proofErr w:type="gramEnd"/>
       <w:r>
         <w:t xml:space="preserve">. </w:t>
       </w:r>
@@ -24664,7 +27030,25 @@
           <w:b/>
           <w:color w:val="FF0000"/>
         </w:rPr>
-        <w:t>在论文的写作过程中，我得到了导师××老师的悉心指导。本文从选题、构思、行文到修改订稿甚至标点符号，都凝结了××老师的汗水。论文的写作方法和技巧方面也得到了××老师的诸多宝贵意见。他严谨的学术态度，认真负责的敬业精神和平易近人的处世风格使我受益匪浅，其间给予我的鼓励和支持也使我更加自信。在此，本人向××老师表示真诚的感谢和由衷的敬意！</w:t>
+        <w:t>在论文的写作过程中，我得到了导师××老师的悉心指导。本文从选题、构思、行文到修改订</w:t>
+      </w:r>
+      <w:proofErr w:type="gramStart"/>
+      <w:r>
+        <w:rPr>
+          <w:rFonts w:hint="eastAsia"/>
+          <w:b/>
+          <w:color w:val="FF0000"/>
+        </w:rPr>
+        <w:t>稿甚至</w:t>
+      </w:r>
+      <w:proofErr w:type="gramEnd"/>
+      <w:r>
+        <w:rPr>
+          <w:rFonts w:hint="eastAsia"/>
+          <w:b/>
+          <w:color w:val="FF0000"/>
+        </w:rPr>
+        <w:t>标点符号，都凝结了××老师的汗水。论文的写作方法和技巧方面也得到了××老师的诸多宝贵意见。他严谨的学术态度，认真负责的敬业精神和平易近人的处世风格使我受益匪浅，其间给予我的鼓励和支持也使我更加自信。在此，本人向××老师表示真诚的感谢和由衷的敬意！</w:t>
       </w:r>
     </w:p>
     <w:p>
@@ -25100,7 +27484,13 @@
       <w:rPr>
         <w:rFonts w:hint="eastAsia"/>
       </w:rPr>
-      <w:t>浙大城市学院毕业论文（设计）</w:t>
+      <w:t>浙大城市学院毕业论文（</w:t>
+    </w:r>
+    <w:r>
+      <w:rPr>
+        <w:rFonts w:hint="eastAsia"/>
+      </w:rPr>
+      <w:t>设计）</w:t>
     </w:r>
     <w:r>
       <w:ptab w:relativeTo="margin" w:alignment="right" w:leader="none"/>
@@ -25132,7 +27522,7 @@
         <w:rFonts w:hint="eastAsia"/>
         <w:noProof/>
       </w:rPr>
-      <w:t>6</w:t>
+      <w:t>3</w:t>
     </w:r>
     <w:r>
       <w:rPr>
@@ -25140,6 +27530,20 @@
         <w:noProof/>
       </w:rPr>
       <w:t>章</w:t>
+    </w:r>
+    <w:r>
+      <w:rPr>
+        <w:rFonts w:hint="eastAsia"/>
+        <w:noProof/>
+      </w:rPr>
+      <w:t xml:space="preserve"> </w:t>
+    </w:r>
+    <w:r>
+      <w:rPr>
+        <w:rFonts w:hint="eastAsia"/>
+        <w:noProof/>
+      </w:rPr>
+      <w:t>核心通信框架与树形路由机制设计</w:t>
     </w:r>
     <w:r>
       <w:fldChar w:fldCharType="end"/>
@@ -25422,7 +27826,13 @@
       <w:rPr>
         <w:rFonts w:hint="eastAsia"/>
       </w:rPr>
-      <w:t>浙大城市学院毕业论文（设计）</w:t>
+      <w:t>浙大城市学院毕业论文（</w:t>
+    </w:r>
+    <w:r>
+      <w:rPr>
+        <w:rFonts w:hint="eastAsia"/>
+      </w:rPr>
+      <w:t>设计）</w:t>
     </w:r>
     <w:r>
       <w:ptab w:relativeTo="margin" w:alignment="right" w:leader="none"/>

</xml_diff>